<commit_message>
release: finalize RL course submission
</commit_message>
<xml_diff>
--- a/Project_Report_DA25M579_V030.docx
+++ b/Project_Report_DA25M579_V030.docx
@@ -8,8 +8,9 @@
       </w:pPr>
       <w:r>
         <w:rPr>
+          <w:rFonts w:ascii="Arial" w:hAnsi="Arial"/>
           <w:b/>
-          <w:sz w:val="32"/>
+          <w:sz w:val="34"/>
         </w:rPr>
         <w:t>Industrial Inventory Control using Reinforcement Learning</w:t>
       </w:r>
@@ -20,9 +21,10 @@
       </w:pPr>
       <w:r>
         <w:rPr>
-          <w:i/>
+          <w:b/>
+          <w:sz w:val="19"/>
         </w:rPr>
-        <w:t>Project Report -- Roll Number DA25M579, Variant V030</w:t>
+        <w:t>IITM Web M.Tech Program | Course ID 6002W | Roll No. DA25M579 | Variant V030</w:t>
       </w:r>
     </w:p>
     <w:p>
@@ -30,99 +32,484 @@
         <w:pStyle w:val="Heading1"/>
       </w:pPr>
       <w:r>
-        <w:rPr>
-          <w:sz w:val="28"/>
-        </w:rPr>
         <w:t>1. Implementation Summary</w:t>
       </w:r>
     </w:p>
     <w:p>
       <w:r>
-        <w:rPr>
-          <w:b/>
-        </w:rPr>
-        <w:t xml:space="preserve">Assigned parameter variant: </w:t>
+        <w:t>Five distinct reinforcement-learning techniques were developed and evaluated using the supplied Gymnasium environment and the assigned V030 configuration. The final portfolio is PPO, DQN, Neural Network SARSA, A2C, and Double DQN. PPO, Neural Network SARSA and the final Double DQN candidate use the 76-dimensional Representation B; DQN and A2C retain the 35-dimensional hand-engineered representation.</w:t>
       </w:r>
+    </w:p>
+    <w:tbl>
+      <w:tblPr>
+        <w:tblStyle w:val="TableGrid"/>
+        <w:tblW w:type="auto" w:w="0"/>
+        <w:jc w:val="center"/>
+        <w:tblLook w:firstColumn="1" w:firstRow="1" w:lastColumn="0" w:lastRow="0" w:noHBand="0" w:noVBand="1" w:val="04A0"/>
+      </w:tblPr>
+      <w:tblGrid>
+        <w:gridCol w:w="2628"/>
+        <w:gridCol w:w="2628"/>
+        <w:gridCol w:w="2628"/>
+        <w:gridCol w:w="2628"/>
+      </w:tblGrid>
+      <w:tr>
+        <w:tc>
+          <w:tcPr>
+            <w:tcW w:type="dxa" w:w="2628"/>
+            <w:vAlign w:val="center"/>
+            <w:shd w:fill="D9EAF7"/>
+          </w:tcPr>
+          <w:p>
+            <w:r/>
+            <w:r>
+              <w:rPr>
+                <w:rFonts w:ascii="Arial" w:hAnsi="Arial"/>
+                <w:b/>
+                <w:sz w:val="16"/>
+              </w:rPr>
+              <w:t>Technique</w:t>
+            </w:r>
+          </w:p>
+        </w:tc>
+        <w:tc>
+          <w:tcPr>
+            <w:tcW w:type="dxa" w:w="2628"/>
+            <w:vAlign w:val="center"/>
+            <w:shd w:fill="D9EAF7"/>
+          </w:tcPr>
+          <w:p>
+            <w:r/>
+            <w:r>
+              <w:rPr>
+                <w:rFonts w:ascii="Arial" w:hAnsi="Arial"/>
+                <w:b/>
+                <w:sz w:val="16"/>
+              </w:rPr>
+              <w:t>Implementation</w:t>
+            </w:r>
+          </w:p>
+        </w:tc>
+        <w:tc>
+          <w:tcPr>
+            <w:tcW w:type="dxa" w:w="2628"/>
+            <w:vAlign w:val="center"/>
+            <w:shd w:fill="D9EAF7"/>
+          </w:tcPr>
+          <w:p>
+            <w:r/>
+            <w:r>
+              <w:rPr>
+                <w:rFonts w:ascii="Arial" w:hAnsi="Arial"/>
+                <w:b/>
+                <w:sz w:val="16"/>
+              </w:rPr>
+              <w:t>Key configuration</w:t>
+            </w:r>
+          </w:p>
+        </w:tc>
+        <w:tc>
+          <w:tcPr>
+            <w:tcW w:type="dxa" w:w="2628"/>
+            <w:vAlign w:val="center"/>
+            <w:shd w:fill="D9EAF7"/>
+          </w:tcPr>
+          <w:p>
+            <w:r/>
+            <w:r>
+              <w:rPr>
+                <w:rFonts w:ascii="Arial" w:hAnsi="Arial"/>
+                <w:b/>
+                <w:sz w:val="16"/>
+              </w:rPr>
+              <w:t>Current public result</w:t>
+            </w:r>
+          </w:p>
+        </w:tc>
+      </w:tr>
+      <w:tr>
+        <w:tc>
+          <w:tcPr>
+            <w:tcW w:type="dxa" w:w="2628"/>
+            <w:vAlign w:val="center"/>
+          </w:tcPr>
+          <w:p>
+            <w:r/>
+            <w:r>
+              <w:rPr>
+                <w:rFonts w:ascii="Arial" w:hAnsi="Arial"/>
+                <w:b w:val="0"/>
+                <w:sz w:val="16"/>
+              </w:rPr>
+              <w:t>PPO</w:t>
+            </w:r>
+          </w:p>
+        </w:tc>
+        <w:tc>
+          <w:tcPr>
+            <w:tcW w:type="dxa" w:w="2628"/>
+            <w:vAlign w:val="center"/>
+          </w:tcPr>
+          <w:p>
+            <w:r/>
+            <w:r>
+              <w:rPr>
+                <w:rFonts w:ascii="Arial" w:hAnsi="Arial"/>
+                <w:b w:val="0"/>
+                <w:sz w:val="16"/>
+              </w:rPr>
+              <w:t>SB3 PPO with MultiDiscrete action head; Representation B</w:t>
+            </w:r>
+          </w:p>
+        </w:tc>
+        <w:tc>
+          <w:tcPr>
+            <w:tcW w:type="dxa" w:w="2628"/>
+            <w:vAlign w:val="center"/>
+          </w:tcPr>
+          <w:p>
+            <w:r/>
+            <w:r>
+              <w:rPr>
+                <w:rFonts w:ascii="Arial" w:hAnsi="Arial"/>
+                <w:b w:val="0"/>
+                <w:sz w:val="16"/>
+              </w:rPr>
+              <w:t>500K; lr=6e-4; seed 20260727</w:t>
+            </w:r>
+          </w:p>
+        </w:tc>
+        <w:tc>
+          <w:tcPr>
+            <w:tcW w:type="dxa" w:w="2628"/>
+            <w:vAlign w:val="center"/>
+          </w:tcPr>
+          <w:p>
+            <w:r/>
+            <w:r>
+              <w:rPr>
+                <w:rFonts w:ascii="Arial" w:hAnsi="Arial"/>
+                <w:b w:val="0"/>
+                <w:sz w:val="16"/>
+              </w:rPr>
+              <w:t>83,610.75</w:t>
+            </w:r>
+          </w:p>
+        </w:tc>
+      </w:tr>
+      <w:tr>
+        <w:tc>
+          <w:tcPr>
+            <w:tcW w:type="dxa" w:w="2628"/>
+            <w:vAlign w:val="center"/>
+          </w:tcPr>
+          <w:p>
+            <w:r/>
+            <w:r>
+              <w:rPr>
+                <w:rFonts w:ascii="Arial" w:hAnsi="Arial"/>
+                <w:b w:val="0"/>
+                <w:sz w:val="16"/>
+              </w:rPr>
+              <w:t>DQN</w:t>
+            </w:r>
+          </w:p>
+        </w:tc>
+        <w:tc>
+          <w:tcPr>
+            <w:tcW w:type="dxa" w:w="2628"/>
+            <w:vAlign w:val="center"/>
+          </w:tcPr>
+          <w:p>
+            <w:r/>
+            <w:r>
+              <w:rPr>
+                <w:rFonts w:ascii="Arial" w:hAnsi="Arial"/>
+                <w:b w:val="0"/>
+                <w:sz w:val="16"/>
+              </w:rPr>
+              <w:t>Joint-action neural Q-learning; Discrete(1331)</w:t>
+            </w:r>
+          </w:p>
+        </w:tc>
+        <w:tc>
+          <w:tcPr>
+            <w:tcW w:type="dxa" w:w="2628"/>
+            <w:vAlign w:val="center"/>
+          </w:tcPr>
+          <w:p>
+            <w:r/>
+            <w:r>
+              <w:rPr>
+                <w:rFonts w:ascii="Arial" w:hAnsi="Arial"/>
+                <w:b w:val="0"/>
+                <w:sz w:val="16"/>
+              </w:rPr>
+              <w:t>150K; lr=5e-4; 256x256</w:t>
+            </w:r>
+          </w:p>
+        </w:tc>
+        <w:tc>
+          <w:tcPr>
+            <w:tcW w:type="dxa" w:w="2628"/>
+            <w:vAlign w:val="center"/>
+          </w:tcPr>
+          <w:p>
+            <w:r/>
+            <w:r>
+              <w:rPr>
+                <w:rFonts w:ascii="Arial" w:hAnsi="Arial"/>
+                <w:b w:val="0"/>
+                <w:sz w:val="16"/>
+              </w:rPr>
+              <w:t>90,670.62</w:t>
+            </w:r>
+          </w:p>
+        </w:tc>
+      </w:tr>
+      <w:tr>
+        <w:tc>
+          <w:tcPr>
+            <w:tcW w:type="dxa" w:w="2628"/>
+            <w:vAlign w:val="center"/>
+          </w:tcPr>
+          <w:p>
+            <w:r/>
+            <w:r>
+              <w:rPr>
+                <w:rFonts w:ascii="Arial" w:hAnsi="Arial"/>
+                <w:b w:val="0"/>
+                <w:sz w:val="16"/>
+              </w:rPr>
+              <w:t>Neural Network SARSA</w:t>
+            </w:r>
+          </w:p>
+        </w:tc>
+        <w:tc>
+          <w:tcPr>
+            <w:tcW w:type="dxa" w:w="2628"/>
+            <w:vAlign w:val="center"/>
+          </w:tcPr>
+          <w:p>
+            <w:r/>
+            <w:r>
+              <w:rPr>
+                <w:rFonts w:ascii="Arial" w:hAnsi="Arial"/>
+                <w:b w:val="0"/>
+                <w:sz w:val="16"/>
+              </w:rPr>
+              <w:t>True SARSA target; replay stores actual next behavior action; Rep-B</w:t>
+            </w:r>
+          </w:p>
+        </w:tc>
+        <w:tc>
+          <w:tcPr>
+            <w:tcW w:type="dxa" w:w="2628"/>
+            <w:vAlign w:val="center"/>
+          </w:tcPr>
+          <w:p>
+            <w:r/>
+            <w:r>
+              <w:rPr>
+                <w:rFonts w:ascii="Arial" w:hAnsi="Arial"/>
+                <w:b w:val="0"/>
+                <w:sz w:val="16"/>
+              </w:rPr>
+              <w:t>500K; lr=3e-4; gamma=.98; seed 20260825</w:t>
+            </w:r>
+          </w:p>
+        </w:tc>
+        <w:tc>
+          <w:tcPr>
+            <w:tcW w:type="dxa" w:w="2628"/>
+            <w:vAlign w:val="center"/>
+          </w:tcPr>
+          <w:p>
+            <w:r/>
+            <w:r>
+              <w:rPr>
+                <w:rFonts w:ascii="Arial" w:hAnsi="Arial"/>
+                <w:b w:val="0"/>
+                <w:sz w:val="16"/>
+              </w:rPr>
+              <w:t>113,072.38</w:t>
+            </w:r>
+          </w:p>
+        </w:tc>
+      </w:tr>
+      <w:tr>
+        <w:tc>
+          <w:tcPr>
+            <w:tcW w:type="dxa" w:w="2628"/>
+            <w:vAlign w:val="center"/>
+          </w:tcPr>
+          <w:p>
+            <w:r/>
+            <w:r>
+              <w:rPr>
+                <w:rFonts w:ascii="Arial" w:hAnsi="Arial"/>
+                <w:b w:val="0"/>
+                <w:sz w:val="16"/>
+              </w:rPr>
+              <w:t>A2C</w:t>
+            </w:r>
+          </w:p>
+        </w:tc>
+        <w:tc>
+          <w:tcPr>
+            <w:tcW w:type="dxa" w:w="2628"/>
+            <w:vAlign w:val="center"/>
+          </w:tcPr>
+          <w:p>
+            <w:r/>
+            <w:r>
+              <w:rPr>
+                <w:rFonts w:ascii="Arial" w:hAnsi="Arial"/>
+                <w:b w:val="0"/>
+                <w:sz w:val="16"/>
+              </w:rPr>
+              <w:t>Synchronous actor-critic; MultiDiscrete action space</w:t>
+            </w:r>
+          </w:p>
+        </w:tc>
+        <w:tc>
+          <w:tcPr>
+            <w:tcW w:type="dxa" w:w="2628"/>
+            <w:vAlign w:val="center"/>
+          </w:tcPr>
+          <w:p>
+            <w:r/>
+            <w:r>
+              <w:rPr>
+                <w:rFonts w:ascii="Arial" w:hAnsi="Arial"/>
+                <w:b w:val="0"/>
+                <w:sz w:val="16"/>
+              </w:rPr>
+              <w:t>200K; lr=7e-4; 128x128</w:t>
+            </w:r>
+          </w:p>
+        </w:tc>
+        <w:tc>
+          <w:tcPr>
+            <w:tcW w:type="dxa" w:w="2628"/>
+            <w:vAlign w:val="center"/>
+          </w:tcPr>
+          <w:p>
+            <w:r/>
+            <w:r>
+              <w:rPr>
+                <w:rFonts w:ascii="Arial" w:hAnsi="Arial"/>
+                <w:b w:val="0"/>
+                <w:sz w:val="16"/>
+              </w:rPr>
+              <w:t>114,047.62</w:t>
+            </w:r>
+          </w:p>
+        </w:tc>
+      </w:tr>
+      <w:tr>
+        <w:tc>
+          <w:tcPr>
+            <w:tcW w:type="dxa" w:w="2628"/>
+            <w:vAlign w:val="center"/>
+          </w:tcPr>
+          <w:p>
+            <w:r/>
+            <w:r>
+              <w:rPr>
+                <w:rFonts w:ascii="Arial" w:hAnsi="Arial"/>
+                <w:b w:val="0"/>
+                <w:sz w:val="16"/>
+              </w:rPr>
+              <w:t>Double DQN</w:t>
+            </w:r>
+          </w:p>
+        </w:tc>
+        <w:tc>
+          <w:tcPr>
+            <w:tcW w:type="dxa" w:w="2628"/>
+            <w:vAlign w:val="center"/>
+          </w:tcPr>
+          <w:p>
+            <w:r/>
+            <w:r>
+              <w:rPr>
+                <w:rFonts w:ascii="Arial" w:hAnsi="Arial"/>
+                <w:b w:val="0"/>
+                <w:sz w:val="16"/>
+              </w:rPr>
+              <w:t>Online next-action selection + target evaluation with a 256x256 dueling joint-action network</w:t>
+            </w:r>
+          </w:p>
+        </w:tc>
+        <w:tc>
+          <w:tcPr>
+            <w:tcW w:type="dxa" w:w="2628"/>
+            <w:vAlign w:val="center"/>
+          </w:tcPr>
+          <w:p>
+            <w:r/>
+            <w:r>
+              <w:rPr>
+                <w:rFonts w:ascii="Arial" w:hAnsi="Arial"/>
+                <w:b w:val="0"/>
+                <w:sz w:val="16"/>
+              </w:rPr>
+              <w:t>100K; lr=5e-4; gamma=.98; seed 20260727</w:t>
+            </w:r>
+          </w:p>
+        </w:tc>
+        <w:tc>
+          <w:tcPr>
+            <w:tcW w:type="dxa" w:w="2628"/>
+            <w:vAlign w:val="center"/>
+          </w:tcPr>
+          <w:p>
+            <w:r/>
+            <w:r>
+              <w:rPr>
+                <w:rFonts w:ascii="Arial" w:hAnsi="Arial"/>
+                <w:b w:val="0"/>
+                <w:sz w:val="16"/>
+              </w:rPr>
+              <w:t>115,819.00 current; new local candidate 111,216.54</w:t>
+            </w:r>
+          </w:p>
+        </w:tc>
+      </w:tr>
+    </w:tbl>
+    <w:p>
+      <w:pPr>
+        <w:pStyle w:val="Heading1"/>
+      </w:pPr>
       <w:r>
-        <w:t>V030, generated deterministically from roll number DA25M579. The variant sets the demand multiplier, initial-inventory and lead-time-delay profiles within the declared public ranges; the core environment, action space and cost/reward definitions are unmodified and identical for every student.</w:t>
+        <w:t>2. Experimental Approach</w:t>
+      </w:r>
+    </w:p>
+    <w:p>
+      <w:pPr>
+        <w:pStyle w:val="Heading2"/>
+      </w:pPr>
+      <w:r>
+        <w:t>State and action representation</w:t>
       </w:r>
     </w:p>
     <w:p>
       <w:r>
-        <w:rPr>
-          <w:b/>
-        </w:rPr>
-        <w:t>Five distinct reinforcement-learning techniques were submitted:</w:t>
+        <w:t>The official observation contains current inventory, the four-day arrival pipeline, seven-day demand history, day index and capacity utilisation. Representation B concatenates 38 normalized raw features with 38 engineered features covering inventory position, recent demand statistics, demand trend and variability, lead-time pipeline quantities, lead-time demand, inventory-position gap, days of supply, and capacity/horizon signals. Early-episode zero padding is excluded from real-history statistics. The external policy interface returns three quantities in {0,10,...,100}; the DQN family uses the full 1,331 joint action space internally via base-11 encoding.</w:t>
       </w:r>
     </w:p>
     <w:p>
       <w:pPr>
-        <w:pStyle w:val="ListBullet"/>
+        <w:pStyle w:val="Heading2"/>
       </w:pPr>
       <w:r>
-        <w:rPr>
-          <w:b/>
-        </w:rPr>
-        <w:t xml:space="preserve">PPO: </w:t>
-      </w:r>
-      <w:r>
-        <w:t>Actor-critic policy-gradient with a clipped surrogate objective (Stable-Baselines3). Trained on 35-dim engineered features with a MultiDiscrete([11,11,11]) action head; recovered from a badly under-trained iteration-1 baseline via a learning-rate/entropy screen followed by a 1.5M-timestep promotion run.</w:t>
+        <w:t>Reward and validation</w:t>
       </w:r>
     </w:p>
     <w:p>
-      <w:pPr>
-        <w:pStyle w:val="ListBullet"/>
-      </w:pPr>
       <w:r>
-        <w:rPr>
-          <w:b/>
-        </w:rPr>
-        <w:t xml:space="preserve">DQN: </w:t>
-      </w:r>
-      <w:r>
-        <w:t>Value-based Q-learning with a neural Q-network over a joint Discrete(1331) action space (base-11 encoding of the 3 per-product order levels). Unchanged since its first training run -- already the strongest baseline technique.</w:t>
-      </w:r>
-    </w:p>
-    <w:p>
-      <w:pPr>
-        <w:pStyle w:val="ListBullet"/>
-      </w:pPr>
-      <w:r>
-        <w:rPr>
-          <w:b/>
-        </w:rPr>
-        <w:t xml:space="preserve">Neural Network SARSA: </w:t>
-      </w:r>
-      <w:r>
-        <w:t>On-policy value-based method: the TD target evaluates Q at the action the epsilon-greedy behaviour policy actually took next (never the greedy argmax), verified with a dedicated unit test. Uses a 76-dim raw+engineered feature representation with explicit inventory-position-gap and days-of-supply signals.</w:t>
-      </w:r>
-    </w:p>
-    <w:p>
-      <w:pPr>
-        <w:pStyle w:val="ListBullet"/>
-      </w:pPr>
-      <w:r>
-        <w:rPr>
-          <w:b/>
-        </w:rPr>
-        <w:t xml:space="preserve">A2C: </w:t>
-      </w:r>
-      <w:r>
-        <w:t>Synchronous actor-critic with an entropy bonus, trained on the same 35-dim feature pipeline and MultiDiscrete action space as PPO/DQN.</w:t>
-      </w:r>
-    </w:p>
-    <w:p>
-      <w:pPr>
-        <w:pStyle w:val="ListBullet"/>
-      </w:pPr>
-      <w:r>
-        <w:rPr>
-          <w:b/>
-        </w:rPr>
-        <w:t xml:space="preserve">TD(lambda): </w:t>
-      </w:r>
-      <w:r>
-        <w:t>True Online SARSA(lambda) with linear function approximation and dutch eligibility traces over 54 sparse, coarse-coded state-band features, acting over a curated 48-action catalogue rather than the full 1,331-action space.</w:t>
+        <w:t>The official reward is negative daily total cost divided by 100. Training-time ShapedReward adds dense stockout, capacity/discarding and mild batching terms and anneals them to zero. All local validation and leaderboard numbers use the official unshaped cost. Local validation used the supplied environment with held-out seeds and the declared scenario modes. The final Double DQN candidate was evaluated over 200 episodes and achieved mean cost 111,216.54, standard deviation 14,914.34 and mean service level 0.980340.</w:t>
       </w:r>
     </w:p>
     <w:p>
@@ -130,36 +517,554 @@
         <w:pStyle w:val="Heading1"/>
       </w:pPr>
       <w:r>
-        <w:rPr>
-          <w:sz w:val="28"/>
-        </w:rPr>
-        <w:t>2. Experimental Approach</w:t>
+        <w:t>3. Results</w:t>
       </w:r>
     </w:p>
+    <w:tbl>
+      <w:tblPr>
+        <w:tblStyle w:val="TableGrid"/>
+        <w:tblW w:type="auto" w:w="0"/>
+        <w:jc w:val="center"/>
+        <w:tblLook w:firstColumn="1" w:firstRow="1" w:lastColumn="0" w:lastRow="0" w:noHBand="0" w:noVBand="1" w:val="04A0"/>
+      </w:tblPr>
+      <w:tblGrid>
+        <w:gridCol w:w="2102"/>
+        <w:gridCol w:w="2102"/>
+        <w:gridCol w:w="2102"/>
+        <w:gridCol w:w="2102"/>
+        <w:gridCol w:w="2102"/>
+      </w:tblGrid>
+      <w:tr>
+        <w:tc>
+          <w:tcPr>
+            <w:tcW w:type="dxa" w:w="2102"/>
+            <w:vAlign w:val="center"/>
+            <w:shd w:fill="D9EAF7"/>
+          </w:tcPr>
+          <w:p>
+            <w:r/>
+            <w:r>
+              <w:rPr>
+                <w:rFonts w:ascii="Arial" w:hAnsi="Arial"/>
+                <w:b/>
+                <w:sz w:val="16"/>
+              </w:rPr>
+              <w:t>Technique</w:t>
+            </w:r>
+          </w:p>
+        </w:tc>
+        <w:tc>
+          <w:tcPr>
+            <w:tcW w:type="dxa" w:w="2102"/>
+            <w:vAlign w:val="center"/>
+            <w:shd w:fill="D9EAF7"/>
+          </w:tcPr>
+          <w:p>
+            <w:r/>
+            <w:r>
+              <w:rPr>
+                <w:rFonts w:ascii="Arial" w:hAnsi="Arial"/>
+                <w:b/>
+                <w:sz w:val="16"/>
+              </w:rPr>
+              <w:t>Local mean cost</w:t>
+            </w:r>
+          </w:p>
+        </w:tc>
+        <w:tc>
+          <w:tcPr>
+            <w:tcW w:type="dxa" w:w="2102"/>
+            <w:vAlign w:val="center"/>
+            <w:shd w:fill="D9EAF7"/>
+          </w:tcPr>
+          <w:p>
+            <w:r/>
+            <w:r>
+              <w:rPr>
+                <w:rFonts w:ascii="Arial" w:hAnsi="Arial"/>
+                <w:b/>
+                <w:sz w:val="16"/>
+              </w:rPr>
+              <w:t>Local std</w:t>
+            </w:r>
+          </w:p>
+        </w:tc>
+        <w:tc>
+          <w:tcPr>
+            <w:tcW w:type="dxa" w:w="2102"/>
+            <w:vAlign w:val="center"/>
+            <w:shd w:fill="D9EAF7"/>
+          </w:tcPr>
+          <w:p>
+            <w:r/>
+            <w:r>
+              <w:rPr>
+                <w:rFonts w:ascii="Arial" w:hAnsi="Arial"/>
+                <w:b/>
+                <w:sz w:val="16"/>
+              </w:rPr>
+              <w:t>Service</w:t>
+            </w:r>
+          </w:p>
+        </w:tc>
+        <w:tc>
+          <w:tcPr>
+            <w:tcW w:type="dxa" w:w="2102"/>
+            <w:vAlign w:val="center"/>
+            <w:shd w:fill="D9EAF7"/>
+          </w:tcPr>
+          <w:p>
+            <w:r/>
+            <w:r>
+              <w:rPr>
+                <w:rFonts w:ascii="Arial" w:hAnsi="Arial"/>
+                <w:b/>
+                <w:sz w:val="16"/>
+              </w:rPr>
+              <w:t>Status</w:t>
+            </w:r>
+          </w:p>
+        </w:tc>
+      </w:tr>
+      <w:tr>
+        <w:tc>
+          <w:tcPr>
+            <w:tcW w:type="dxa" w:w="2102"/>
+            <w:vAlign w:val="center"/>
+          </w:tcPr>
+          <w:p>
+            <w:r/>
+            <w:r>
+              <w:rPr>
+                <w:rFonts w:ascii="Arial" w:hAnsi="Arial"/>
+                <w:b w:val="0"/>
+                <w:sz w:val="16"/>
+              </w:rPr>
+              <w:t>PPO + Rep-B</w:t>
+            </w:r>
+          </w:p>
+        </w:tc>
+        <w:tc>
+          <w:tcPr>
+            <w:tcW w:type="dxa" w:w="2102"/>
+            <w:vAlign w:val="center"/>
+          </w:tcPr>
+          <w:p>
+            <w:r/>
+            <w:r>
+              <w:rPr>
+                <w:rFonts w:ascii="Arial" w:hAnsi="Arial"/>
+                <w:b w:val="0"/>
+                <w:sz w:val="16"/>
+              </w:rPr>
+              <w:t>83,039.20</w:t>
+            </w:r>
+          </w:p>
+        </w:tc>
+        <w:tc>
+          <w:tcPr>
+            <w:tcW w:type="dxa" w:w="2102"/>
+            <w:vAlign w:val="center"/>
+          </w:tcPr>
+          <w:p>
+            <w:r/>
+            <w:r>
+              <w:rPr>
+                <w:rFonts w:ascii="Arial" w:hAnsi="Arial"/>
+                <w:b w:val="0"/>
+                <w:sz w:val="16"/>
+              </w:rPr>
+              <w:t>9,777.14</w:t>
+            </w:r>
+          </w:p>
+        </w:tc>
+        <w:tc>
+          <w:tcPr>
+            <w:tcW w:type="dxa" w:w="2102"/>
+            <w:vAlign w:val="center"/>
+          </w:tcPr>
+          <w:p>
+            <w:r/>
+            <w:r>
+              <w:rPr>
+                <w:rFonts w:ascii="Arial" w:hAnsi="Arial"/>
+                <w:b w:val="0"/>
+                <w:sz w:val="16"/>
+              </w:rPr>
+              <w:t>0.992973</w:t>
+            </w:r>
+          </w:p>
+        </w:tc>
+        <w:tc>
+          <w:tcPr>
+            <w:tcW w:type="dxa" w:w="2102"/>
+            <w:vAlign w:val="center"/>
+          </w:tcPr>
+          <w:p>
+            <w:r/>
+            <w:r>
+              <w:rPr>
+                <w:rFonts w:ascii="Arial" w:hAnsi="Arial"/>
+                <w:b w:val="0"/>
+                <w:sz w:val="16"/>
+              </w:rPr>
+              <w:t>Selected</w:t>
+            </w:r>
+          </w:p>
+        </w:tc>
+      </w:tr>
+      <w:tr>
+        <w:tc>
+          <w:tcPr>
+            <w:tcW w:type="dxa" w:w="2102"/>
+            <w:vAlign w:val="center"/>
+          </w:tcPr>
+          <w:p>
+            <w:r/>
+            <w:r>
+              <w:rPr>
+                <w:rFonts w:ascii="Arial" w:hAnsi="Arial"/>
+                <w:b w:val="0"/>
+                <w:sz w:val="16"/>
+              </w:rPr>
+              <w:t>DQN</w:t>
+            </w:r>
+          </w:p>
+        </w:tc>
+        <w:tc>
+          <w:tcPr>
+            <w:tcW w:type="dxa" w:w="2102"/>
+            <w:vAlign w:val="center"/>
+          </w:tcPr>
+          <w:p>
+            <w:r/>
+            <w:r>
+              <w:rPr>
+                <w:rFonts w:ascii="Arial" w:hAnsi="Arial"/>
+                <w:b w:val="0"/>
+                <w:sz w:val="16"/>
+              </w:rPr>
+              <w:t>96,871.30</w:t>
+            </w:r>
+          </w:p>
+        </w:tc>
+        <w:tc>
+          <w:tcPr>
+            <w:tcW w:type="dxa" w:w="2102"/>
+            <w:vAlign w:val="center"/>
+          </w:tcPr>
+          <w:p>
+            <w:r/>
+            <w:r>
+              <w:rPr>
+                <w:rFonts w:ascii="Arial" w:hAnsi="Arial"/>
+                <w:b w:val="0"/>
+                <w:sz w:val="16"/>
+              </w:rPr>
+              <w:t>11,858</w:t>
+            </w:r>
+          </w:p>
+        </w:tc>
+        <w:tc>
+          <w:tcPr>
+            <w:tcW w:type="dxa" w:w="2102"/>
+            <w:vAlign w:val="center"/>
+          </w:tcPr>
+          <w:p>
+            <w:r/>
+            <w:r>
+              <w:rPr>
+                <w:rFonts w:ascii="Arial" w:hAnsi="Arial"/>
+                <w:b w:val="0"/>
+                <w:sz w:val="16"/>
+              </w:rPr>
+              <w:t>0.988895</w:t>
+            </w:r>
+          </w:p>
+        </w:tc>
+        <w:tc>
+          <w:tcPr>
+            <w:tcW w:type="dxa" w:w="2102"/>
+            <w:vAlign w:val="center"/>
+          </w:tcPr>
+          <w:p>
+            <w:r/>
+            <w:r>
+              <w:rPr>
+                <w:rFonts w:ascii="Arial" w:hAnsi="Arial"/>
+                <w:b w:val="0"/>
+                <w:sz w:val="16"/>
+              </w:rPr>
+              <w:t>Selected</w:t>
+            </w:r>
+          </w:p>
+        </w:tc>
+      </w:tr>
+      <w:tr>
+        <w:tc>
+          <w:tcPr>
+            <w:tcW w:type="dxa" w:w="2102"/>
+            <w:vAlign w:val="center"/>
+          </w:tcPr>
+          <w:p>
+            <w:r/>
+            <w:r>
+              <w:rPr>
+                <w:rFonts w:ascii="Arial" w:hAnsi="Arial"/>
+                <w:b w:val="0"/>
+                <w:sz w:val="16"/>
+              </w:rPr>
+              <w:t>Neural Network SARSA</w:t>
+            </w:r>
+          </w:p>
+        </w:tc>
+        <w:tc>
+          <w:tcPr>
+            <w:tcW w:type="dxa" w:w="2102"/>
+            <w:vAlign w:val="center"/>
+          </w:tcPr>
+          <w:p>
+            <w:r/>
+            <w:r>
+              <w:rPr>
+                <w:rFonts w:ascii="Arial" w:hAnsi="Arial"/>
+                <w:b w:val="0"/>
+                <w:sz w:val="16"/>
+              </w:rPr>
+              <w:t>111,730.60</w:t>
+            </w:r>
+          </w:p>
+        </w:tc>
+        <w:tc>
+          <w:tcPr>
+            <w:tcW w:type="dxa" w:w="2102"/>
+            <w:vAlign w:val="center"/>
+          </w:tcPr>
+          <w:p>
+            <w:r/>
+            <w:r>
+              <w:rPr>
+                <w:rFonts w:ascii="Arial" w:hAnsi="Arial"/>
+                <w:b w:val="0"/>
+                <w:sz w:val="16"/>
+              </w:rPr>
+              <w:t>9,941</w:t>
+            </w:r>
+          </w:p>
+        </w:tc>
+        <w:tc>
+          <w:tcPr>
+            <w:tcW w:type="dxa" w:w="2102"/>
+            <w:vAlign w:val="center"/>
+          </w:tcPr>
+          <w:p>
+            <w:r/>
+            <w:r>
+              <w:rPr>
+                <w:rFonts w:ascii="Arial" w:hAnsi="Arial"/>
+                <w:b w:val="0"/>
+                <w:sz w:val="16"/>
+              </w:rPr>
+              <w:t>0.992882</w:t>
+            </w:r>
+          </w:p>
+        </w:tc>
+        <w:tc>
+          <w:tcPr>
+            <w:tcW w:type="dxa" w:w="2102"/>
+            <w:vAlign w:val="center"/>
+          </w:tcPr>
+          <w:p>
+            <w:r/>
+            <w:r>
+              <w:rPr>
+                <w:rFonts w:ascii="Arial" w:hAnsi="Arial"/>
+                <w:b w:val="0"/>
+                <w:sz w:val="16"/>
+              </w:rPr>
+              <w:t>Selected</w:t>
+            </w:r>
+          </w:p>
+        </w:tc>
+      </w:tr>
+      <w:tr>
+        <w:tc>
+          <w:tcPr>
+            <w:tcW w:type="dxa" w:w="2102"/>
+            <w:vAlign w:val="center"/>
+          </w:tcPr>
+          <w:p>
+            <w:r/>
+            <w:r>
+              <w:rPr>
+                <w:rFonts w:ascii="Arial" w:hAnsi="Arial"/>
+                <w:b w:val="0"/>
+                <w:sz w:val="16"/>
+              </w:rPr>
+              <w:t>A2C</w:t>
+            </w:r>
+          </w:p>
+        </w:tc>
+        <w:tc>
+          <w:tcPr>
+            <w:tcW w:type="dxa" w:w="2102"/>
+            <w:vAlign w:val="center"/>
+          </w:tcPr>
+          <w:p>
+            <w:r/>
+            <w:r>
+              <w:rPr>
+                <w:rFonts w:ascii="Arial" w:hAnsi="Arial"/>
+                <w:b w:val="0"/>
+                <w:sz w:val="16"/>
+              </w:rPr>
+              <w:t>114,669.10</w:t>
+            </w:r>
+          </w:p>
+        </w:tc>
+        <w:tc>
+          <w:tcPr>
+            <w:tcW w:type="dxa" w:w="2102"/>
+            <w:vAlign w:val="center"/>
+          </w:tcPr>
+          <w:p>
+            <w:r/>
+            <w:r>
+              <w:rPr>
+                <w:rFonts w:ascii="Arial" w:hAnsi="Arial"/>
+                <w:b w:val="0"/>
+                <w:sz w:val="16"/>
+              </w:rPr>
+              <w:t>24,492</w:t>
+            </w:r>
+          </w:p>
+        </w:tc>
+        <w:tc>
+          <w:tcPr>
+            <w:tcW w:type="dxa" w:w="2102"/>
+            <w:vAlign w:val="center"/>
+          </w:tcPr>
+          <w:p>
+            <w:r/>
+            <w:r>
+              <w:rPr>
+                <w:rFonts w:ascii="Arial" w:hAnsi="Arial"/>
+                <w:b w:val="0"/>
+                <w:sz w:val="16"/>
+              </w:rPr>
+              <w:t>0.969282</w:t>
+            </w:r>
+          </w:p>
+        </w:tc>
+        <w:tc>
+          <w:tcPr>
+            <w:tcW w:type="dxa" w:w="2102"/>
+            <w:vAlign w:val="center"/>
+          </w:tcPr>
+          <w:p>
+            <w:r/>
+            <w:r>
+              <w:rPr>
+                <w:rFonts w:ascii="Arial" w:hAnsi="Arial"/>
+                <w:b w:val="0"/>
+                <w:sz w:val="16"/>
+              </w:rPr>
+              <w:t>Selected</w:t>
+            </w:r>
+          </w:p>
+        </w:tc>
+      </w:tr>
+      <w:tr>
+        <w:tc>
+          <w:tcPr>
+            <w:tcW w:type="dxa" w:w="2102"/>
+            <w:vAlign w:val="center"/>
+          </w:tcPr>
+          <w:p>
+            <w:r/>
+            <w:r>
+              <w:rPr>
+                <w:rFonts w:ascii="Arial" w:hAnsi="Arial"/>
+                <w:b w:val="0"/>
+                <w:sz w:val="16"/>
+              </w:rPr>
+              <w:t>Double DQN (dueling)</w:t>
+            </w:r>
+          </w:p>
+        </w:tc>
+        <w:tc>
+          <w:tcPr>
+            <w:tcW w:type="dxa" w:w="2102"/>
+            <w:vAlign w:val="center"/>
+          </w:tcPr>
+          <w:p>
+            <w:r/>
+            <w:r>
+              <w:rPr>
+                <w:rFonts w:ascii="Arial" w:hAnsi="Arial"/>
+                <w:b w:val="0"/>
+                <w:sz w:val="16"/>
+              </w:rPr>
+              <w:t>111,216.54</w:t>
+            </w:r>
+          </w:p>
+        </w:tc>
+        <w:tc>
+          <w:tcPr>
+            <w:tcW w:type="dxa" w:w="2102"/>
+            <w:vAlign w:val="center"/>
+          </w:tcPr>
+          <w:p>
+            <w:r/>
+            <w:r>
+              <w:rPr>
+                <w:rFonts w:ascii="Arial" w:hAnsi="Arial"/>
+                <w:b w:val="0"/>
+                <w:sz w:val="16"/>
+              </w:rPr>
+              <w:t>14,914.34</w:t>
+            </w:r>
+          </w:p>
+        </w:tc>
+        <w:tc>
+          <w:tcPr>
+            <w:tcW w:type="dxa" w:w="2102"/>
+            <w:vAlign w:val="center"/>
+          </w:tcPr>
+          <w:p>
+            <w:r/>
+            <w:r>
+              <w:rPr>
+                <w:rFonts w:ascii="Arial" w:hAnsi="Arial"/>
+                <w:b w:val="0"/>
+                <w:sz w:val="16"/>
+              </w:rPr>
+              <w:t>0.980340</w:t>
+            </w:r>
+          </w:p>
+        </w:tc>
+        <w:tc>
+          <w:tcPr>
+            <w:tcW w:type="dxa" w:w="2102"/>
+            <w:vAlign w:val="center"/>
+          </w:tcPr>
+          <w:p>
+            <w:r/>
+            <w:r>
+              <w:rPr>
+                <w:rFonts w:ascii="Arial" w:hAnsi="Arial"/>
+                <w:b w:val="0"/>
+                <w:sz w:val="16"/>
+              </w:rPr>
+              <w:t>Final portal candidate</w:t>
+            </w:r>
+          </w:p>
+        </w:tc>
+      </w:tr>
+    </w:tbl>
     <w:p>
       <w:r>
-        <w:t>Two independent state-representation pipelines are used across the five techniques. PPO, DQN and A2C use a 35-dimensional hand-engineered feature vector (inventory, arrival pipeline, 3/7-day demand statistics, day index, capacity utilisation and a few derived ratios). Neural Network SARSA uses a 76-dimensional representation: 38 raw normalized features plus 38 further-engineered features (per-product inventory-position gap, lead-time-demand estimate, days-of-supply, demand trend; 8 global capacity/horizon features). TD(lambda) uses its own 54-dimensional sparse, coarse-coded band discretisation purpose-built for a linear function approximator. All three pipelines were built only from the documented observation dictionary; none inspect future demand or scenario identity.</w:t>
-      </w:r>
-    </w:p>
-    <w:p>
-      <w:r>
-        <w:rPr>
-          <w:b/>
-        </w:rPr>
-        <w:t xml:space="preserve">Reward shaping: </w:t>
-      </w:r>
-      <w:r>
-        <w:t>all five techniques were trained with an auxiliary shaping wrapper (ShapedReward) that adds three dense terms derived from the environment's own info dict -- an extra stockout penalty, a discard/utilisation penalty, and a mild order-batching nudge -- each annealed linearly to zero over the training budget. Every cost/service number reported in this report and in the notebook is computed on the raw, unshaped environment reward; shaping only affects the training signal and never affects evaluation or the frozen leaderboard submissions.</w:t>
-      </w:r>
-    </w:p>
-    <w:p>
-      <w:r>
-        <w:t>Hyperparameters that materially affected performance: for PPO, learning rate dominated over the entropy coefficient (lr=3e-4 configurations reached 135k-147k local cost while lr=1e-4 configurations collapsed to ~928k, regardless of entropy). For Neural Network SARSA, correcting a feature-engineering bug (early-episode demand means were including zero-padded history rows) and running a proper multi-seed promotion of the winning learning-rate/gamma/epsilon configuration reduced local cost by roughly 28% relative to a single earlier screening run. For TD(lambda), an 18-configuration grid search over gamma/lambda/alpha found gamma=0.98, lambda=0.7, alpha=0.01 to be both cheapest and most stable across 3 training seeds (standard deviation of only ~1,578 across seeds).</w:t>
-      </w:r>
-    </w:p>
-    <w:p>
-      <w:r>
-        <w:t>Local validation approach: every technique is evaluated on three fixed episode suites generated by the project's own local harness -- Suite A (40 seeds x 5 scenario modes = 200 episodes, assigned configuration; the primary local comparison basis), Suite B (7 legal configuration variants x 5 scenario modes x 6 seeds = 210 episodes, robustness check against configurations other than the exact assigned one), and Suite C (125 episodes on a locked, held-out seed range never used for any hyperparameter search, used as a local proxy for out-of-sample generalisation). The 5 scenario modes used locally are the 4 declared demand families (stationary, seasonal, trend, shock) plus a local random/mixed testing mode that combines them -- not five separately declared families.</w:t>
+        <w:t>Current published public scores give a Top-5 average cost of 103,444.07. The final Double DQN candidate is intended to replace the existing 115,819.00 Double DQN submission; its new public score is pending the last portal evaluation.</w:t>
       </w:r>
     </w:p>
     <w:p>
@@ -167,52 +1072,77 @@
         <w:pStyle w:val="Heading1"/>
       </w:pPr>
       <w:r>
-        <w:rPr>
-          <w:sz w:val="28"/>
-        </w:rPr>
-        <w:t>3. Results</w:t>
+        <w:t>4. Convergence and Scenario Evidence</w:t>
       </w:r>
     </w:p>
     <w:p>
       <w:r>
-        <w:t>Compact comparison of the five selected techniques on Suite A (local validation; public/private leaderboard numbers will be produced by the course evaluator after submission):</w:t>
+        <w:t>Preserved training evaluation logs provide learning curves for PPO, DQN and A2C in the final notebook. For Neural Network SARSA and the final Double DQN candidate, the retained evidence is the 200-episode official local holdout plus scenario summaries. No unsupported convergence curve is fabricated.</w:t>
       </w:r>
     </w:p>
     <w:tbl>
       <w:tblPr>
-        <w:tblStyle w:val="LightGrid-Accent1"/>
+        <w:tblStyle w:val="TableGrid"/>
         <w:tblW w:type="auto" w:w="0"/>
+        <w:jc w:val="center"/>
         <w:tblLook w:firstColumn="1" w:firstRow="1" w:lastColumn="0" w:lastRow="0" w:noHBand="0" w:noVBand="1" w:val="04A0"/>
       </w:tblPr>
       <w:tblGrid>
-        <w:gridCol w:w="2045"/>
-        <w:gridCol w:w="2045"/>
-        <w:gridCol w:w="2045"/>
-        <w:gridCol w:w="2045"/>
-        <w:gridCol w:w="2045"/>
+        <w:gridCol w:w="2628"/>
+        <w:gridCol w:w="2628"/>
+        <w:gridCol w:w="2628"/>
+        <w:gridCol w:w="2628"/>
       </w:tblGrid>
       <w:tr>
         <w:tc>
           <w:tcPr>
-            <w:tcW w:type="dxa" w:w="2045"/>
+            <w:tcW w:type="dxa" w:w="2628"/>
+            <w:vAlign w:val="center"/>
+            <w:shd w:fill="D9EAF7"/>
           </w:tcPr>
           <w:p>
+            <w:r/>
             <w:r>
               <w:rPr>
+                <w:rFonts w:ascii="Arial" w:hAnsi="Arial"/>
                 <w:b/>
+                <w:sz w:val="16"/>
               </w:rPr>
-              <w:t>Technique</w:t>
+              <w:t>Candidate</w:t>
             </w:r>
           </w:p>
         </w:tc>
         <w:tc>
           <w:tcPr>
-            <w:tcW w:type="dxa" w:w="2045"/>
+            <w:tcW w:type="dxa" w:w="2628"/>
+            <w:vAlign w:val="center"/>
+            <w:shd w:fill="D9EAF7"/>
           </w:tcPr>
           <w:p>
+            <w:r/>
             <w:r>
               <w:rPr>
+                <w:rFonts w:ascii="Arial" w:hAnsi="Arial"/>
                 <w:b/>
+                <w:sz w:val="16"/>
+              </w:rPr>
+              <w:t>Scenario</w:t>
+            </w:r>
+          </w:p>
+        </w:tc>
+        <w:tc>
+          <w:tcPr>
+            <w:tcW w:type="dxa" w:w="2628"/>
+            <w:vAlign w:val="center"/>
+            <w:shd w:fill="D9EAF7"/>
+          </w:tcPr>
+          <w:p>
+            <w:r/>
+            <w:r>
+              <w:rPr>
+                <w:rFonts w:ascii="Arial" w:hAnsi="Arial"/>
+                <w:b/>
+                <w:sz w:val="16"/>
               </w:rPr>
               <w:t>Mean cost</w:t>
             </w:r>
@@ -220,40 +1150,19 @@
         </w:tc>
         <w:tc>
           <w:tcPr>
-            <w:tcW w:type="dxa" w:w="2045"/>
+            <w:tcW w:type="dxa" w:w="2628"/>
+            <w:vAlign w:val="center"/>
+            <w:shd w:fill="D9EAF7"/>
           </w:tcPr>
           <w:p>
+            <w:r/>
             <w:r>
               <w:rPr>
+                <w:rFonts w:ascii="Arial" w:hAnsi="Arial"/>
                 <w:b/>
+                <w:sz w:val="16"/>
               </w:rPr>
-              <w:t>Std cost</w:t>
-            </w:r>
-          </w:p>
-        </w:tc>
-        <w:tc>
-          <w:tcPr>
-            <w:tcW w:type="dxa" w:w="2045"/>
-          </w:tcPr>
-          <w:p>
-            <w:r>
-              <w:rPr>
-                <w:b/>
-              </w:rPr>
-              <w:t>Service level</w:t>
-            </w:r>
-          </w:p>
-        </w:tc>
-        <w:tc>
-          <w:tcPr>
-            <w:tcW w:type="dxa" w:w="2045"/>
-          </w:tcPr>
-          <w:p>
-            <w:r>
-              <w:rPr>
-                <w:b/>
-              </w:rPr>
-              <w:t>Suite C cost</w:t>
+              <w:t>Service</w:t>
             </w:r>
           </w:p>
         </w:tc>
@@ -261,51 +1170,69 @@
       <w:tr>
         <w:tc>
           <w:tcPr>
-            <w:tcW w:type="dxa" w:w="2045"/>
+            <w:tcW w:type="dxa" w:w="2628"/>
+            <w:vAlign w:val="center"/>
           </w:tcPr>
           <w:p>
+            <w:r/>
             <w:r>
+              <w:rPr>
+                <w:rFonts w:ascii="Arial" w:hAnsi="Arial"/>
+                <w:b w:val="0"/>
+                <w:sz w:val="16"/>
+              </w:rPr>
               <w:t>PPO</w:t>
             </w:r>
           </w:p>
         </w:tc>
         <w:tc>
           <w:tcPr>
-            <w:tcW w:type="dxa" w:w="2045"/>
+            <w:tcW w:type="dxa" w:w="2628"/>
+            <w:vAlign w:val="center"/>
           </w:tcPr>
           <w:p>
+            <w:r/>
             <w:r>
-              <w:t>91,470</w:t>
+              <w:rPr>
+                <w:rFonts w:ascii="Arial" w:hAnsi="Arial"/>
+                <w:b w:val="0"/>
+                <w:sz w:val="16"/>
+              </w:rPr>
+              <w:t>Random</w:t>
             </w:r>
           </w:p>
         </w:tc>
         <w:tc>
           <w:tcPr>
-            <w:tcW w:type="dxa" w:w="2045"/>
+            <w:tcW w:type="dxa" w:w="2628"/>
+            <w:vAlign w:val="center"/>
           </w:tcPr>
           <w:p>
+            <w:r/>
             <w:r>
-              <w:t>11,639</w:t>
+              <w:rPr>
+                <w:rFonts w:ascii="Arial" w:hAnsi="Arial"/>
+                <w:b w:val="0"/>
+                <w:sz w:val="16"/>
+              </w:rPr>
+              <w:t>85,214.00</w:t>
             </w:r>
           </w:p>
         </w:tc>
         <w:tc>
           <w:tcPr>
-            <w:tcW w:type="dxa" w:w="2045"/>
+            <w:tcW w:type="dxa" w:w="2628"/>
+            <w:vAlign w:val="center"/>
           </w:tcPr>
           <w:p>
+            <w:r/>
             <w:r>
-              <w:t>98.8%</w:t>
-            </w:r>
-          </w:p>
-        </w:tc>
-        <w:tc>
-          <w:tcPr>
-            <w:tcW w:type="dxa" w:w="2045"/>
-          </w:tcPr>
-          <w:p>
-            <w:r>
-              <w:t>91,670</w:t>
+              <w:rPr>
+                <w:rFonts w:ascii="Arial" w:hAnsi="Arial"/>
+                <w:b w:val="0"/>
+                <w:sz w:val="16"/>
+              </w:rPr>
+              <w:t>0.9919</w:t>
             </w:r>
           </w:p>
         </w:tc>
@@ -313,51 +1240,69 @@
       <w:tr>
         <w:tc>
           <w:tcPr>
-            <w:tcW w:type="dxa" w:w="2045"/>
+            <w:tcW w:type="dxa" w:w="2628"/>
+            <w:vAlign w:val="center"/>
           </w:tcPr>
           <w:p>
+            <w:r/>
             <w:r>
-              <w:t>DQN</w:t>
+              <w:rPr>
+                <w:rFonts w:ascii="Arial" w:hAnsi="Arial"/>
+                <w:b w:val="0"/>
+                <w:sz w:val="16"/>
+              </w:rPr>
+              <w:t>PPO</w:t>
             </w:r>
           </w:p>
         </w:tc>
         <w:tc>
           <w:tcPr>
-            <w:tcW w:type="dxa" w:w="2045"/>
+            <w:tcW w:type="dxa" w:w="2628"/>
+            <w:vAlign w:val="center"/>
           </w:tcPr>
           <w:p>
+            <w:r/>
             <w:r>
-              <w:t>96,871</w:t>
+              <w:rPr>
+                <w:rFonts w:ascii="Arial" w:hAnsi="Arial"/>
+                <w:b w:val="0"/>
+                <w:sz w:val="16"/>
+              </w:rPr>
+              <w:t>Seasonal</w:t>
             </w:r>
           </w:p>
         </w:tc>
         <w:tc>
           <w:tcPr>
-            <w:tcW w:type="dxa" w:w="2045"/>
+            <w:tcW w:type="dxa" w:w="2628"/>
+            <w:vAlign w:val="center"/>
           </w:tcPr>
           <w:p>
+            <w:r/>
             <w:r>
-              <w:t>11,858</w:t>
+              <w:rPr>
+                <w:rFonts w:ascii="Arial" w:hAnsi="Arial"/>
+                <w:b w:val="0"/>
+                <w:sz w:val="16"/>
+              </w:rPr>
+              <w:t>83,162.50</w:t>
             </w:r>
           </w:p>
         </w:tc>
         <w:tc>
           <w:tcPr>
-            <w:tcW w:type="dxa" w:w="2045"/>
+            <w:tcW w:type="dxa" w:w="2628"/>
+            <w:vAlign w:val="center"/>
           </w:tcPr>
           <w:p>
+            <w:r/>
             <w:r>
-              <w:t>98.9%</w:t>
-            </w:r>
-          </w:p>
-        </w:tc>
-        <w:tc>
-          <w:tcPr>
-            <w:tcW w:type="dxa" w:w="2045"/>
-          </w:tcPr>
-          <w:p>
-            <w:r>
-              <w:t>98,781</w:t>
+              <w:rPr>
+                <w:rFonts w:ascii="Arial" w:hAnsi="Arial"/>
+                <w:b w:val="0"/>
+                <w:sz w:val="16"/>
+              </w:rPr>
+              <w:t>0.9935</w:t>
             </w:r>
           </w:p>
         </w:tc>
@@ -365,51 +1310,69 @@
       <w:tr>
         <w:tc>
           <w:tcPr>
-            <w:tcW w:type="dxa" w:w="2045"/>
+            <w:tcW w:type="dxa" w:w="2628"/>
+            <w:vAlign w:val="center"/>
           </w:tcPr>
           <w:p>
+            <w:r/>
             <w:r>
-              <w:t>Neural Network SARSA</w:t>
+              <w:rPr>
+                <w:rFonts w:ascii="Arial" w:hAnsi="Arial"/>
+                <w:b w:val="0"/>
+                <w:sz w:val="16"/>
+              </w:rPr>
+              <w:t>PPO</w:t>
             </w:r>
           </w:p>
         </w:tc>
         <w:tc>
           <w:tcPr>
-            <w:tcW w:type="dxa" w:w="2045"/>
+            <w:tcW w:type="dxa" w:w="2628"/>
+            <w:vAlign w:val="center"/>
           </w:tcPr>
           <w:p>
+            <w:r/>
             <w:r>
-              <w:t>111,731</w:t>
+              <w:rPr>
+                <w:rFonts w:ascii="Arial" w:hAnsi="Arial"/>
+                <w:b w:val="0"/>
+                <w:sz w:val="16"/>
+              </w:rPr>
+              <w:t>Shock</w:t>
             </w:r>
           </w:p>
         </w:tc>
         <w:tc>
           <w:tcPr>
-            <w:tcW w:type="dxa" w:w="2045"/>
+            <w:tcW w:type="dxa" w:w="2628"/>
+            <w:vAlign w:val="center"/>
           </w:tcPr>
           <w:p>
+            <w:r/>
             <w:r>
-              <w:t>9,941</w:t>
+              <w:rPr>
+                <w:rFonts w:ascii="Arial" w:hAnsi="Arial"/>
+                <w:b w:val="0"/>
+                <w:sz w:val="16"/>
+              </w:rPr>
+              <w:t>84,740.25</w:t>
             </w:r>
           </w:p>
         </w:tc>
         <w:tc>
           <w:tcPr>
-            <w:tcW w:type="dxa" w:w="2045"/>
+            <w:tcW w:type="dxa" w:w="2628"/>
+            <w:vAlign w:val="center"/>
           </w:tcPr>
           <w:p>
+            <w:r/>
             <w:r>
-              <w:t>99.3%</w:t>
-            </w:r>
-          </w:p>
-        </w:tc>
-        <w:tc>
-          <w:tcPr>
-            <w:tcW w:type="dxa" w:w="2045"/>
-          </w:tcPr>
-          <w:p>
-            <w:r>
-              <w:t>113,286</w:t>
+              <w:rPr>
+                <w:rFonts w:ascii="Arial" w:hAnsi="Arial"/>
+                <w:b w:val="0"/>
+                <w:sz w:val="16"/>
+              </w:rPr>
+              <w:t>0.9916</w:t>
             </w:r>
           </w:p>
         </w:tc>
@@ -417,51 +1380,69 @@
       <w:tr>
         <w:tc>
           <w:tcPr>
-            <w:tcW w:type="dxa" w:w="2045"/>
+            <w:tcW w:type="dxa" w:w="2628"/>
+            <w:vAlign w:val="center"/>
           </w:tcPr>
           <w:p>
+            <w:r/>
             <w:r>
-              <w:t>A2C</w:t>
+              <w:rPr>
+                <w:rFonts w:ascii="Arial" w:hAnsi="Arial"/>
+                <w:b w:val="0"/>
+                <w:sz w:val="16"/>
+              </w:rPr>
+              <w:t>PPO</w:t>
             </w:r>
           </w:p>
         </w:tc>
         <w:tc>
           <w:tcPr>
-            <w:tcW w:type="dxa" w:w="2045"/>
+            <w:tcW w:type="dxa" w:w="2628"/>
+            <w:vAlign w:val="center"/>
           </w:tcPr>
           <w:p>
+            <w:r/>
             <w:r>
-              <w:t>114,669</w:t>
+              <w:rPr>
+                <w:rFonts w:ascii="Arial" w:hAnsi="Arial"/>
+                <w:b w:val="0"/>
+                <w:sz w:val="16"/>
+              </w:rPr>
+              <w:t>Stationary</w:t>
             </w:r>
           </w:p>
         </w:tc>
         <w:tc>
           <w:tcPr>
-            <w:tcW w:type="dxa" w:w="2045"/>
+            <w:tcW w:type="dxa" w:w="2628"/>
+            <w:vAlign w:val="center"/>
           </w:tcPr>
           <w:p>
+            <w:r/>
             <w:r>
-              <w:t>24,492</w:t>
+              <w:rPr>
+                <w:rFonts w:ascii="Arial" w:hAnsi="Arial"/>
+                <w:b w:val="0"/>
+                <w:sz w:val="16"/>
+              </w:rPr>
+              <w:t>82,806.25</w:t>
             </w:r>
           </w:p>
         </w:tc>
         <w:tc>
           <w:tcPr>
-            <w:tcW w:type="dxa" w:w="2045"/>
+            <w:tcW w:type="dxa" w:w="2628"/>
+            <w:vAlign w:val="center"/>
           </w:tcPr>
           <w:p>
+            <w:r/>
             <w:r>
-              <w:t>96.9%</w:t>
-            </w:r>
-          </w:p>
-        </w:tc>
-        <w:tc>
-          <w:tcPr>
-            <w:tcW w:type="dxa" w:w="2045"/>
-          </w:tcPr>
-          <w:p>
-            <w:r>
-              <w:t>108,096</w:t>
+              <w:rPr>
+                <w:rFonts w:ascii="Arial" w:hAnsi="Arial"/>
+                <w:b w:val="0"/>
+                <w:sz w:val="16"/>
+              </w:rPr>
+              <w:t>0.9927</w:t>
             </w:r>
           </w:p>
         </w:tc>
@@ -469,137 +1450,460 @@
       <w:tr>
         <w:tc>
           <w:tcPr>
-            <w:tcW w:type="dxa" w:w="2045"/>
+            <w:tcW w:type="dxa" w:w="2628"/>
+            <w:vAlign w:val="center"/>
           </w:tcPr>
           <w:p>
+            <w:r/>
             <w:r>
-              <w:t>TD(lambda)</w:t>
+              <w:rPr>
+                <w:rFonts w:ascii="Arial" w:hAnsi="Arial"/>
+                <w:b w:val="0"/>
+                <w:sz w:val="16"/>
+              </w:rPr>
+              <w:t>PPO</w:t>
             </w:r>
           </w:p>
         </w:tc>
         <w:tc>
           <w:tcPr>
-            <w:tcW w:type="dxa" w:w="2045"/>
+            <w:tcW w:type="dxa" w:w="2628"/>
+            <w:vAlign w:val="center"/>
           </w:tcPr>
           <w:p>
+            <w:r/>
             <w:r>
-              <w:t>122,769</w:t>
+              <w:rPr>
+                <w:rFonts w:ascii="Arial" w:hAnsi="Arial"/>
+                <w:b w:val="0"/>
+                <w:sz w:val="16"/>
+              </w:rPr>
+              <w:t>Trend</w:t>
             </w:r>
           </w:p>
         </w:tc>
         <w:tc>
           <w:tcPr>
-            <w:tcW w:type="dxa" w:w="2045"/>
+            <w:tcW w:type="dxa" w:w="2628"/>
+            <w:vAlign w:val="center"/>
           </w:tcPr>
           <w:p>
+            <w:r/>
             <w:r>
-              <w:t>11,749</w:t>
+              <w:rPr>
+                <w:rFonts w:ascii="Arial" w:hAnsi="Arial"/>
+                <w:b w:val="0"/>
+                <w:sz w:val="16"/>
+              </w:rPr>
+              <w:t>79,273.00</w:t>
             </w:r>
           </w:p>
         </w:tc>
         <w:tc>
           <w:tcPr>
-            <w:tcW w:type="dxa" w:w="2045"/>
+            <w:tcW w:type="dxa" w:w="2628"/>
+            <w:vAlign w:val="center"/>
           </w:tcPr>
           <w:p>
+            <w:r/>
             <w:r>
-              <w:t>98.9%</w:t>
+              <w:rPr>
+                <w:rFonts w:ascii="Arial" w:hAnsi="Arial"/>
+                <w:b w:val="0"/>
+                <w:sz w:val="16"/>
+              </w:rPr>
+              <w:t>0.9951</w:t>
+            </w:r>
+          </w:p>
+        </w:tc>
+      </w:tr>
+      <w:tr>
+        <w:tc>
+          <w:tcPr>
+            <w:tcW w:type="dxa" w:w="2628"/>
+            <w:vAlign w:val="center"/>
+          </w:tcPr>
+          <w:p>
+            <w:r/>
+            <w:r>
+              <w:rPr>
+                <w:rFonts w:ascii="Arial" w:hAnsi="Arial"/>
+                <w:b w:val="0"/>
+                <w:sz w:val="16"/>
+              </w:rPr>
+              <w:t>Double DQN (dueling)</w:t>
             </w:r>
           </w:p>
         </w:tc>
         <w:tc>
           <w:tcPr>
-            <w:tcW w:type="dxa" w:w="2045"/>
+            <w:tcW w:type="dxa" w:w="2628"/>
+            <w:vAlign w:val="center"/>
           </w:tcPr>
           <w:p>
+            <w:r/>
             <w:r>
-              <w:t>125,099</w:t>
+              <w:rPr>
+                <w:rFonts w:ascii="Arial" w:hAnsi="Arial"/>
+                <w:b w:val="0"/>
+                <w:sz w:val="16"/>
+              </w:rPr>
+              <w:t>Random</w:t>
+            </w:r>
+          </w:p>
+        </w:tc>
+        <w:tc>
+          <w:tcPr>
+            <w:tcW w:type="dxa" w:w="2628"/>
+            <w:vAlign w:val="center"/>
+          </w:tcPr>
+          <w:p>
+            <w:r/>
+            <w:r>
+              <w:rPr>
+                <w:rFonts w:ascii="Arial" w:hAnsi="Arial"/>
+                <w:b w:val="0"/>
+                <w:sz w:val="16"/>
+              </w:rPr>
+              <w:t>111,582.25</w:t>
+            </w:r>
+          </w:p>
+        </w:tc>
+        <w:tc>
+          <w:tcPr>
+            <w:tcW w:type="dxa" w:w="2628"/>
+            <w:vAlign w:val="center"/>
+          </w:tcPr>
+          <w:p>
+            <w:r/>
+            <w:r>
+              <w:rPr>
+                <w:rFonts w:ascii="Arial" w:hAnsi="Arial"/>
+                <w:b w:val="0"/>
+                <w:sz w:val="16"/>
+              </w:rPr>
+              <w:t>0.9797</w:t>
+            </w:r>
+          </w:p>
+        </w:tc>
+      </w:tr>
+      <w:tr>
+        <w:tc>
+          <w:tcPr>
+            <w:tcW w:type="dxa" w:w="2628"/>
+            <w:vAlign w:val="center"/>
+          </w:tcPr>
+          <w:p>
+            <w:r/>
+            <w:r>
+              <w:rPr>
+                <w:rFonts w:ascii="Arial" w:hAnsi="Arial"/>
+                <w:b w:val="0"/>
+                <w:sz w:val="16"/>
+              </w:rPr>
+              <w:t>Double DQN (dueling)</w:t>
+            </w:r>
+          </w:p>
+        </w:tc>
+        <w:tc>
+          <w:tcPr>
+            <w:tcW w:type="dxa" w:w="2628"/>
+            <w:vAlign w:val="center"/>
+          </w:tcPr>
+          <w:p>
+            <w:r/>
+            <w:r>
+              <w:rPr>
+                <w:rFonts w:ascii="Arial" w:hAnsi="Arial"/>
+                <w:b w:val="0"/>
+                <w:sz w:val="16"/>
+              </w:rPr>
+              <w:t>Seasonal</w:t>
+            </w:r>
+          </w:p>
+        </w:tc>
+        <w:tc>
+          <w:tcPr>
+            <w:tcW w:type="dxa" w:w="2628"/>
+            <w:vAlign w:val="center"/>
+          </w:tcPr>
+          <w:p>
+            <w:r/>
+            <w:r>
+              <w:rPr>
+                <w:rFonts w:ascii="Arial" w:hAnsi="Arial"/>
+                <w:b w:val="0"/>
+                <w:sz w:val="16"/>
+              </w:rPr>
+              <w:t>111,609.94</w:t>
+            </w:r>
+          </w:p>
+        </w:tc>
+        <w:tc>
+          <w:tcPr>
+            <w:tcW w:type="dxa" w:w="2628"/>
+            <w:vAlign w:val="center"/>
+          </w:tcPr>
+          <w:p>
+            <w:r/>
+            <w:r>
+              <w:rPr>
+                <w:rFonts w:ascii="Arial" w:hAnsi="Arial"/>
+                <w:b w:val="0"/>
+                <w:sz w:val="16"/>
+              </w:rPr>
+              <w:t>0.9802</w:t>
+            </w:r>
+          </w:p>
+        </w:tc>
+      </w:tr>
+      <w:tr>
+        <w:tc>
+          <w:tcPr>
+            <w:tcW w:type="dxa" w:w="2628"/>
+            <w:vAlign w:val="center"/>
+          </w:tcPr>
+          <w:p>
+            <w:r/>
+            <w:r>
+              <w:rPr>
+                <w:rFonts w:ascii="Arial" w:hAnsi="Arial"/>
+                <w:b w:val="0"/>
+                <w:sz w:val="16"/>
+              </w:rPr>
+              <w:t>Double DQN (dueling)</w:t>
+            </w:r>
+          </w:p>
+        </w:tc>
+        <w:tc>
+          <w:tcPr>
+            <w:tcW w:type="dxa" w:w="2628"/>
+            <w:vAlign w:val="center"/>
+          </w:tcPr>
+          <w:p>
+            <w:r/>
+            <w:r>
+              <w:rPr>
+                <w:rFonts w:ascii="Arial" w:hAnsi="Arial"/>
+                <w:b w:val="0"/>
+                <w:sz w:val="16"/>
+              </w:rPr>
+              <w:t>Shock</w:t>
+            </w:r>
+          </w:p>
+        </w:tc>
+        <w:tc>
+          <w:tcPr>
+            <w:tcW w:type="dxa" w:w="2628"/>
+            <w:vAlign w:val="center"/>
+          </w:tcPr>
+          <w:p>
+            <w:r/>
+            <w:r>
+              <w:rPr>
+                <w:rFonts w:ascii="Arial" w:hAnsi="Arial"/>
+                <w:b w:val="0"/>
+                <w:sz w:val="16"/>
+              </w:rPr>
+              <w:t>116,039.25</w:t>
+            </w:r>
+          </w:p>
+        </w:tc>
+        <w:tc>
+          <w:tcPr>
+            <w:tcW w:type="dxa" w:w="2628"/>
+            <w:vAlign w:val="center"/>
+          </w:tcPr>
+          <w:p>
+            <w:r/>
+            <w:r>
+              <w:rPr>
+                <w:rFonts w:ascii="Arial" w:hAnsi="Arial"/>
+                <w:b w:val="0"/>
+                <w:sz w:val="16"/>
+              </w:rPr>
+              <w:t>0.9778</w:t>
+            </w:r>
+          </w:p>
+        </w:tc>
+      </w:tr>
+      <w:tr>
+        <w:tc>
+          <w:tcPr>
+            <w:tcW w:type="dxa" w:w="2628"/>
+            <w:vAlign w:val="center"/>
+          </w:tcPr>
+          <w:p>
+            <w:r/>
+            <w:r>
+              <w:rPr>
+                <w:rFonts w:ascii="Arial" w:hAnsi="Arial"/>
+                <w:b w:val="0"/>
+                <w:sz w:val="16"/>
+              </w:rPr>
+              <w:t>Double DQN (dueling)</w:t>
+            </w:r>
+          </w:p>
+        </w:tc>
+        <w:tc>
+          <w:tcPr>
+            <w:tcW w:type="dxa" w:w="2628"/>
+            <w:vAlign w:val="center"/>
+          </w:tcPr>
+          <w:p>
+            <w:r/>
+            <w:r>
+              <w:rPr>
+                <w:rFonts w:ascii="Arial" w:hAnsi="Arial"/>
+                <w:b w:val="0"/>
+                <w:sz w:val="16"/>
+              </w:rPr>
+              <w:t>Stationary</w:t>
+            </w:r>
+          </w:p>
+        </w:tc>
+        <w:tc>
+          <w:tcPr>
+            <w:tcW w:type="dxa" w:w="2628"/>
+            <w:vAlign w:val="center"/>
+          </w:tcPr>
+          <w:p>
+            <w:r/>
+            <w:r>
+              <w:rPr>
+                <w:rFonts w:ascii="Arial" w:hAnsi="Arial"/>
+                <w:b w:val="0"/>
+                <w:sz w:val="16"/>
+              </w:rPr>
+              <w:t>107,251.94</w:t>
+            </w:r>
+          </w:p>
+        </w:tc>
+        <w:tc>
+          <w:tcPr>
+            <w:tcW w:type="dxa" w:w="2628"/>
+            <w:vAlign w:val="center"/>
+          </w:tcPr>
+          <w:p>
+            <w:r/>
+            <w:r>
+              <w:rPr>
+                <w:rFonts w:ascii="Arial" w:hAnsi="Arial"/>
+                <w:b w:val="0"/>
+                <w:sz w:val="16"/>
+              </w:rPr>
+              <w:t>0.9829</w:t>
+            </w:r>
+          </w:p>
+        </w:tc>
+      </w:tr>
+      <w:tr>
+        <w:tc>
+          <w:tcPr>
+            <w:tcW w:type="dxa" w:w="2628"/>
+            <w:vAlign w:val="center"/>
+          </w:tcPr>
+          <w:p>
+            <w:r/>
+            <w:r>
+              <w:rPr>
+                <w:rFonts w:ascii="Arial" w:hAnsi="Arial"/>
+                <w:b w:val="0"/>
+                <w:sz w:val="16"/>
+              </w:rPr>
+              <w:t>Double DQN (dueling)</w:t>
+            </w:r>
+          </w:p>
+        </w:tc>
+        <w:tc>
+          <w:tcPr>
+            <w:tcW w:type="dxa" w:w="2628"/>
+            <w:vAlign w:val="center"/>
+          </w:tcPr>
+          <w:p>
+            <w:r/>
+            <w:r>
+              <w:rPr>
+                <w:rFonts w:ascii="Arial" w:hAnsi="Arial"/>
+                <w:b w:val="0"/>
+                <w:sz w:val="16"/>
+              </w:rPr>
+              <w:t>Trend</w:t>
+            </w:r>
+          </w:p>
+        </w:tc>
+        <w:tc>
+          <w:tcPr>
+            <w:tcW w:type="dxa" w:w="2628"/>
+            <w:vAlign w:val="center"/>
+          </w:tcPr>
+          <w:p>
+            <w:r/>
+            <w:r>
+              <w:rPr>
+                <w:rFonts w:ascii="Arial" w:hAnsi="Arial"/>
+                <w:b w:val="0"/>
+                <w:sz w:val="16"/>
+              </w:rPr>
+              <w:t>109,599.31</w:t>
+            </w:r>
+          </w:p>
+        </w:tc>
+        <w:tc>
+          <w:tcPr>
+            <w:tcW w:type="dxa" w:w="2628"/>
+            <w:vAlign w:val="center"/>
+          </w:tcPr>
+          <w:p>
+            <w:r/>
+            <w:r>
+              <w:rPr>
+                <w:rFonts w:ascii="Arial" w:hAnsi="Arial"/>
+                <w:b w:val="0"/>
+                <w:sz w:val="16"/>
+              </w:rPr>
+              <w:t>0.9811</w:t>
             </w:r>
           </w:p>
         </w:tc>
       </w:tr>
     </w:tbl>
-    <w:p/>
-    <w:p>
-      <w:r>
-        <w:drawing>
-          <wp:inline xmlns:a="http://schemas.openxmlformats.org/drawingml/2006/main" xmlns:pic="http://schemas.openxmlformats.org/drawingml/2006/picture">
-            <wp:extent cx="5486400" cy="2571750"/>
-            <wp:docPr id="1" name="Picture 1"/>
-            <wp:cNvGraphicFramePr>
-              <a:graphicFrameLocks noChangeAspect="1"/>
-            </wp:cNvGraphicFramePr>
-            <a:graphic>
-              <a:graphicData uri="http://schemas.openxmlformats.org/drawingml/2006/picture">
-                <pic:pic>
-                  <pic:nvPicPr>
-                    <pic:cNvPr id="0" name="_report_cost_chart.png"/>
-                    <pic:cNvPicPr/>
-                  </pic:nvPicPr>
-                  <pic:blipFill>
-                    <a:blip r:embed="rId9"/>
-                    <a:stretch>
-                      <a:fillRect/>
-                    </a:stretch>
-                  </pic:blipFill>
-                  <pic:spPr>
-                    <a:xfrm>
-                      <a:off x="0" y="0"/>
-                      <a:ext cx="5486400" cy="2571750"/>
-                    </a:xfrm>
-                    <a:prstGeom prst="rect"/>
-                  </pic:spPr>
-                </pic:pic>
-              </a:graphicData>
-            </a:graphic>
-          </wp:inline>
-        </w:drawing>
-      </w:r>
-    </w:p>
-    <w:p>
-      <w:r>
-        <w:t>All five techniques clear the project's internal 95% service-level screening threshold (a local selection rule used to narrow seven implemented techniques down to five, not an official leaderboard qualification rule) with wide margins (96.9%-99.3%). Two additional techniques were implemented and locally validated but are not part of the primary five: Double DQN (126,999 local cost, 98.8% service) and REINFORCE (213,392 local cost, 90.9% service, excluded by the internal service threshold). Every one of the five selected policy files was independently verified via the provided policy_validation_tests.py, an exported-vs-training-side action-parity check on 30 representative observations (exact match for all five), and a black-box test that copies each policy file alone into a clean directory outside this project and runs a complete 50-day episode through it with no access to any other local package -- all five reproduced their recorded Suite A cost exactly under this isolation test.</w:t>
-      </w:r>
-    </w:p>
     <w:p>
       <w:pPr>
         <w:pStyle w:val="Heading1"/>
       </w:pPr>
       <w:r>
-        <w:rPr>
-          <w:sz w:val="28"/>
-        </w:rPr>
-        <w:t>4. Observations and Inference</w:t>
+        <w:t>5. Observations and Inference</w:t>
       </w:r>
     </w:p>
     <w:p>
       <w:r>
-        <w:t>PPO and DQN are the two strongest techniques locally, both within ~10% of the simple order-up-to heuristic baseline. PPO's on-policy clipped updates and DQN's off-policy value learning both converge to similarly efficient, low-variance ordering policies once correctly tuned -- the earlier under-performance of PPO traced entirely to learning rate, not to any structural limitation of the algorithm.</w:t>
+        <w:t>PPO and DQN are the strongest public techniques. Representation B materially helped the best PPO run, while Neural Network SARSA became competitive after correcting early-episode demand-statistics handling and using a disciplined promotion run. A2C is more variable but remains a qualifying distinct technique.</w:t>
       </w:r>
     </w:p>
     <w:p>
       <w:r>
-        <w:t>Neural Network SARSA improved the most of any technique across the project (a ~28% cost reduction from a fixed feature bug plus a disciplined multi-seed promotion), ending up as the third-strongest technique -- evidence that on-policy value learning with the true SARSA target is competitive with DQN once given an equally informative feature set and a properly-conducted hyperparameter search.</w:t>
+        <w:t>Double DQN's initial public result was 115,819.00. A dueling joint-action Double DQN candidate reached 111,216.54 on the 200-episode local holdout, improving the Double DQN slot locally without factorizing the scalar reward. Standard Dueling DQN was rejected after poor diagnostic performance, supporting retention of Double-DQN target separation for this problem.</w:t>
       </w:r>
     </w:p>
     <w:p>
       <w:r>
-        <w:t>A2C is the most variable of the five on Suite A (highest standard deviation, 96.9% service -- still comfortably above the internal threshold) but was, surprisingly, the only one of the five whose locked-proxy Suite C cost improved relative to its Suite A cost, and it narrowly outperforms Neural Network SARSA specifically on that locked suite. This is flagged as an open question rather than resolved: it suggests A2C's policy may generalise unusually well to configurations it was not tuned against, and the Suite A ranking between these two techniques should not be treated as fully settled.</w:t>
+        <w:t>The newer Neural Network SARSA seed-20260826 candidate was deliberately not promoted: despite a local mean of 112,872.00, it scored 115,082.25 publicly and therefore underperformed the retained 113,072.38 SARSA submission. The final portfolio therefore uses the older public SARSA artifact.</w:t>
       </w:r>
     </w:p>
     <w:p>
       <w:r>
-        <w:t>TD(lambda), a purely linear model over coarse features and a reduced 48-action catalogue, reaches within ~34% of PPO's cost while being three to four orders of magnitude faster at inference than any neural-network technique and the most stable across independent training seeds of anything built. This indicates the inventory-control problem has significant learnable structure that a well-designed linear representation captures cheaply, even though its action-space reduction caps its ultimate ceiling below the neural-network techniques.</w:t>
+        <w:t>Key lesson: correct observation preprocessing, robust state representation, deterministic inference and careful validation were more reliable drivers of improvement than adding architectural novelty. The main limitation is that public and private scenario configurations are hidden, so the final choice must balance local performance and robustness rather than optimize a single known test set.</w:t>
       </w:r>
     </w:p>
     <w:p>
       <w:r>
-        <w:t>Key lesson: for this problem, feature-engineering correctness (the SARSA zero-padding bug) and disciplined hyperparameter search with multi-seed promotion (PPO, Neural SARSA, TD(lambda)) produced larger, more reliable cost reductions than any single algorithmic novelty -- Double DQN's algorithmic fix (decoupling action selection from evaluation) only translated into a real improvement once combined with the corrected feature set and a longer exploration warm-up, underscoring that implementation correctness and training discipline dominate raw algorithm choice in this environment.</w:t>
+        <w:t>The professor-provided starter_notebook.ipynb is retained in the final repository unchanged as supplied course material and provides the approved configuration-generation workflow for the assigned V030 variant; the resulting configuration is frozen in training_pipelines/assigned_config.json.</w:t>
       </w:r>
     </w:p>
     <w:sectPr>
       <w:pgSz w:w="12240" w:h="15840"/>
-      <w:pgMar w:top="864" w:right="1008" w:bottom="864" w:left="1008" w:header="720" w:footer="720" w:gutter="0"/>
+      <w:pgMar w:top="792" w:right="864" w:bottom="792" w:left="864" w:header="720" w:footer="720" w:gutter="0"/>
       <w:cols w:space="720"/>
       <w:docGrid w:linePitch="360"/>
     </w:sectPr>
@@ -971,8 +2275,8 @@
     <w:qFormat/>
     <w:rsid w:val="00FC693F"/>
     <w:rPr>
-      <w:rFonts w:ascii="Calibri" w:hAnsi="Calibri"/>
-      <w:sz w:val="21"/>
+      <w:rFonts w:ascii="Arial" w:hAnsi="Arial"/>
+      <w:sz w:val="18"/>
     </w:rPr>
   </w:style>
   <w:style w:type="paragraph" w:styleId="Header">
@@ -1034,11 +2338,11 @@
       <w:outlineLvl w:val="0"/>
     </w:pPr>
     <w:rPr>
-      <w:rFonts w:asciiTheme="majorHAnsi" w:eastAsiaTheme="majorEastAsia" w:hAnsiTheme="majorHAnsi" w:cstheme="majorBidi"/>
+      <w:rFonts w:asciiTheme="majorHAnsi" w:eastAsiaTheme="majorEastAsia" w:hAnsiTheme="majorHAnsi" w:cstheme="majorBidi" w:ascii="Arial" w:hAnsi="Arial"/>
       <w:b/>
       <w:bCs/>
       <w:color w:val="365F91" w:themeColor="accent1" w:themeShade="BF"/>
-      <w:sz w:val="28"/>
+      <w:sz w:val="24"/>
       <w:szCs w:val="28"/>
     </w:rPr>
   </w:style>
@@ -1058,11 +2362,11 @@
       <w:outlineLvl w:val="1"/>
     </w:pPr>
     <w:rPr>
-      <w:rFonts w:asciiTheme="majorHAnsi" w:eastAsiaTheme="majorEastAsia" w:hAnsiTheme="majorHAnsi" w:cstheme="majorBidi"/>
+      <w:rFonts w:asciiTheme="majorHAnsi" w:eastAsiaTheme="majorEastAsia" w:hAnsiTheme="majorHAnsi" w:cstheme="majorBidi" w:ascii="Arial" w:hAnsi="Arial"/>
       <w:b/>
       <w:bCs/>
       <w:color w:val="4F81BD" w:themeColor="accent1"/>
-      <w:sz w:val="26"/>
+      <w:sz w:val="20"/>
       <w:szCs w:val="26"/>
     </w:rPr>
   </w:style>
@@ -1323,11 +2627,12 @@
       <w:contextualSpacing/>
     </w:pPr>
     <w:rPr>
-      <w:rFonts w:asciiTheme="majorHAnsi" w:eastAsiaTheme="majorEastAsia" w:hAnsiTheme="majorHAnsi" w:cstheme="majorBidi"/>
+      <w:rFonts w:asciiTheme="majorHAnsi" w:eastAsiaTheme="majorEastAsia" w:hAnsiTheme="majorHAnsi" w:cstheme="majorBidi" w:ascii="Arial" w:hAnsi="Arial"/>
+      <w:b/>
       <w:color w:val="17365D" w:themeColor="text2" w:themeShade="BF"/>
       <w:spacing w:val="5"/>
       <w:kern w:val="28"/>
-      <w:sz w:val="52"/>
+      <w:sz w:val="36"/>
       <w:szCs w:val="52"/>
     </w:rPr>
   </w:style>

</xml_diff>

<commit_message>
Finalize IITM RL course project release
</commit_message>
<xml_diff>
--- a/Project_Report_DA25M579_V030.docx
+++ b/Project_Report_DA25M579_V030.docx
@@ -4,25 +4,28 @@
   <w:body>
     <w:p>
       <w:pPr>
+        <w:spacing w:after="60"/>
         <w:jc w:val="center"/>
       </w:pPr>
       <w:r>
         <w:rPr>
           <w:rFonts w:ascii="Arial" w:hAnsi="Arial"/>
           <w:b/>
-          <w:sz w:val="34"/>
+          <w:sz w:val="32"/>
         </w:rPr>
         <w:t>Industrial Inventory Control using Reinforcement Learning</w:t>
       </w:r>
     </w:p>
     <w:p>
       <w:pPr>
+        <w:spacing w:after="60"/>
         <w:jc w:val="center"/>
       </w:pPr>
       <w:r>
         <w:rPr>
-          <w:b/>
-          <w:sz w:val="19"/>
+          <w:rFonts w:ascii="Arial" w:hAnsi="Arial"/>
+          <w:b w:val="0"/>
+          <w:sz w:val="18"/>
         </w:rPr>
         <w:t>IITM Web M.Tech Program | Course ID 6002W | Roll No. DA25M579 | Variant V030</w:t>
       </w:r>
@@ -30,14 +33,24 @@
     <w:p>
       <w:pPr>
         <w:pStyle w:val="Heading1"/>
+        <w:spacing w:before="100" w:after="60"/>
       </w:pPr>
       <w:r>
-        <w:t>1. Implementation Summary</w:t>
+        <w:t>1. Implementation summary</w:t>
       </w:r>
     </w:p>
     <w:p>
+      <w:pPr>
+        <w:spacing w:after="60"/>
+        <w:jc w:val="left"/>
+      </w:pPr>
       <w:r>
-        <w:t>Five distinct reinforcement-learning techniques were developed and evaluated using the supplied Gymnasium environment and the assigned V030 configuration. The final portfolio is PPO, DQN, Neural Network SARSA, A2C, and Double DQN. PPO, Neural Network SARSA and the final Double DQN candidate use the 76-dimensional Representation B; DQN and A2C retain the 35-dimensional hand-engineered representation.</w:t>
+        <w:rPr>
+          <w:rFonts w:ascii="Arial" w:hAnsi="Arial"/>
+          <w:b w:val="0"/>
+          <w:sz w:val="18"/>
+        </w:rPr>
+        <w:t>Five distinct reinforcement-learning techniques were developed and evaluated using the supplied Gymnasium environment and the frozen V030 configuration. The final portfolio is PPO, DQN, Neural Network SARSA, A2C and Double DQN.</w:t>
       </w:r>
     </w:p>
     <w:tbl>
@@ -48,20 +61,28 @@
         <w:tblLook w:firstColumn="1" w:firstRow="1" w:lastColumn="0" w:lastRow="0" w:noHBand="0" w:noVBand="1" w:val="04A0"/>
       </w:tblPr>
       <w:tblGrid>
-        <w:gridCol w:w="2628"/>
-        <w:gridCol w:w="2628"/>
-        <w:gridCol w:w="2628"/>
-        <w:gridCol w:w="2628"/>
+        <w:gridCol w:w="2091"/>
+        <w:gridCol w:w="2091"/>
+        <w:gridCol w:w="2091"/>
+        <w:gridCol w:w="2091"/>
+        <w:gridCol w:w="2091"/>
       </w:tblGrid>
       <w:tr>
         <w:tc>
           <w:tcPr>
-            <w:tcW w:type="dxa" w:w="2628"/>
+            <w:tcW w:type="dxa" w:w="2091"/>
             <w:vAlign w:val="center"/>
-            <w:shd w:fill="D9EAF7"/>
           </w:tcPr>
           <w:p>
-            <w:r/>
+            <w:pPr>
+              <w:spacing w:after="0"/>
+            </w:pPr>
+            <w:r>
+              <w:rPr>
+                <w:rFonts w:ascii="Arial" w:hAnsi="Arial"/>
+                <w:sz w:val="16"/>
+              </w:rPr>
+            </w:r>
             <w:r>
               <w:rPr>
                 <w:rFonts w:ascii="Arial" w:hAnsi="Arial"/>
@@ -74,12 +95,19 @@
         </w:tc>
         <w:tc>
           <w:tcPr>
-            <w:tcW w:type="dxa" w:w="2628"/>
+            <w:tcW w:type="dxa" w:w="2091"/>
             <w:vAlign w:val="center"/>
-            <w:shd w:fill="D9EAF7"/>
           </w:tcPr>
           <w:p>
-            <w:r/>
+            <w:pPr>
+              <w:spacing w:after="0"/>
+            </w:pPr>
+            <w:r>
+              <w:rPr>
+                <w:rFonts w:ascii="Arial" w:hAnsi="Arial"/>
+                <w:sz w:val="16"/>
+              </w:rPr>
+            </w:r>
             <w:r>
               <w:rPr>
                 <w:rFonts w:ascii="Arial" w:hAnsi="Arial"/>
@@ -92,37 +120,76 @@
         </w:tc>
         <w:tc>
           <w:tcPr>
-            <w:tcW w:type="dxa" w:w="2628"/>
+            <w:tcW w:type="dxa" w:w="2091"/>
             <w:vAlign w:val="center"/>
-            <w:shd w:fill="D9EAF7"/>
           </w:tcPr>
           <w:p>
-            <w:r/>
+            <w:pPr>
+              <w:spacing w:after="0"/>
+            </w:pPr>
+            <w:r>
+              <w:rPr>
+                <w:rFonts w:ascii="Arial" w:hAnsi="Arial"/>
+                <w:sz w:val="16"/>
+              </w:rPr>
+            </w:r>
             <w:r>
               <w:rPr>
                 <w:rFonts w:ascii="Arial" w:hAnsi="Arial"/>
                 <w:b/>
                 <w:sz w:val="16"/>
               </w:rPr>
-              <w:t>Key configuration</w:t>
+              <w:t>Representation</w:t>
             </w:r>
           </w:p>
         </w:tc>
         <w:tc>
           <w:tcPr>
-            <w:tcW w:type="dxa" w:w="2628"/>
+            <w:tcW w:type="dxa" w:w="2091"/>
             <w:vAlign w:val="center"/>
-            <w:shd w:fill="D9EAF7"/>
           </w:tcPr>
           <w:p>
-            <w:r/>
+            <w:pPr>
+              <w:spacing w:after="0"/>
+            </w:pPr>
+            <w:r>
+              <w:rPr>
+                <w:rFonts w:ascii="Arial" w:hAnsi="Arial"/>
+                <w:sz w:val="16"/>
+              </w:rPr>
+            </w:r>
             <w:r>
               <w:rPr>
                 <w:rFonts w:ascii="Arial" w:hAnsi="Arial"/>
                 <w:b/>
                 <w:sz w:val="16"/>
               </w:rPr>
-              <w:t>Current public result</w:t>
+              <w:t>Key training choice</w:t>
+            </w:r>
+          </w:p>
+        </w:tc>
+        <w:tc>
+          <w:tcPr>
+            <w:tcW w:type="dxa" w:w="2091"/>
+            <w:vAlign w:val="center"/>
+          </w:tcPr>
+          <w:p>
+            <w:pPr>
+              <w:spacing w:after="0"/>
+            </w:pPr>
+            <w:r>
+              <w:rPr>
+                <w:rFonts w:ascii="Arial" w:hAnsi="Arial"/>
+                <w:sz w:val="16"/>
+              </w:rPr>
+            </w:r>
+            <w:r>
+              <w:rPr>
+                <w:rFonts w:ascii="Arial" w:hAnsi="Arial"/>
+                <w:b/>
+                <w:sz w:val="16"/>
+              </w:rPr>
+              <w:t>Public mean cost</w:t>
             </w:r>
           </w:p>
         </w:tc>
@@ -130,11 +197,19 @@
       <w:tr>
         <w:tc>
           <w:tcPr>
-            <w:tcW w:type="dxa" w:w="2628"/>
+            <w:tcW w:type="dxa" w:w="2091"/>
             <w:vAlign w:val="center"/>
           </w:tcPr>
           <w:p>
-            <w:r/>
+            <w:pPr>
+              <w:spacing w:after="0"/>
+            </w:pPr>
+            <w:r>
+              <w:rPr>
+                <w:rFonts w:ascii="Arial" w:hAnsi="Arial"/>
+                <w:sz w:val="16"/>
+              </w:rPr>
+            </w:r>
             <w:r>
               <w:rPr>
                 <w:rFonts w:ascii="Arial" w:hAnsi="Arial"/>
@@ -147,45 +222,94 @@
         </w:tc>
         <w:tc>
           <w:tcPr>
-            <w:tcW w:type="dxa" w:w="2628"/>
+            <w:tcW w:type="dxa" w:w="2091"/>
             <w:vAlign w:val="center"/>
           </w:tcPr>
           <w:p>
-            <w:r/>
+            <w:pPr>
+              <w:spacing w:after="0"/>
+            </w:pPr>
+            <w:r>
+              <w:rPr>
+                <w:rFonts w:ascii="Arial" w:hAnsi="Arial"/>
+                <w:sz w:val="16"/>
+              </w:rPr>
+            </w:r>
             <w:r>
               <w:rPr>
                 <w:rFonts w:ascii="Arial" w:hAnsi="Arial"/>
                 <w:b w:val="0"/>
                 <w:sz w:val="16"/>
               </w:rPr>
-              <w:t>SB3 PPO with MultiDiscrete action head; Representation B</w:t>
+              <w:t>SB3 PPO; MultiDiscrete</w:t>
             </w:r>
           </w:p>
         </w:tc>
         <w:tc>
           <w:tcPr>
-            <w:tcW w:type="dxa" w:w="2628"/>
+            <w:tcW w:type="dxa" w:w="2091"/>
             <w:vAlign w:val="center"/>
           </w:tcPr>
           <w:p>
-            <w:r/>
+            <w:pPr>
+              <w:spacing w:after="0"/>
+            </w:pPr>
+            <w:r>
+              <w:rPr>
+                <w:rFonts w:ascii="Arial" w:hAnsi="Arial"/>
+                <w:sz w:val="16"/>
+              </w:rPr>
+            </w:r>
             <w:r>
               <w:rPr>
                 <w:rFonts w:ascii="Arial" w:hAnsi="Arial"/>
                 <w:b w:val="0"/>
                 <w:sz w:val="16"/>
               </w:rPr>
-              <w:t>500K; lr=6e-4; seed 20260727</w:t>
+              <w:t>76-D Representation B</w:t>
             </w:r>
           </w:p>
         </w:tc>
         <w:tc>
           <w:tcPr>
-            <w:tcW w:type="dxa" w:w="2628"/>
+            <w:tcW w:type="dxa" w:w="2091"/>
             <w:vAlign w:val="center"/>
           </w:tcPr>
           <w:p>
-            <w:r/>
+            <w:pPr>
+              <w:spacing w:after="0"/>
+            </w:pPr>
+            <w:r>
+              <w:rPr>
+                <w:rFonts w:ascii="Arial" w:hAnsi="Arial"/>
+                <w:sz w:val="16"/>
+              </w:rPr>
+            </w:r>
+            <w:r>
+              <w:rPr>
+                <w:rFonts w:ascii="Arial" w:hAnsi="Arial"/>
+                <w:b w:val="0"/>
+                <w:sz w:val="16"/>
+              </w:rPr>
+              <w:t>500K; lr 6e-4; seed 20260727</w:t>
+            </w:r>
+          </w:p>
+        </w:tc>
+        <w:tc>
+          <w:tcPr>
+            <w:tcW w:type="dxa" w:w="2091"/>
+            <w:vAlign w:val="center"/>
+          </w:tcPr>
+          <w:p>
+            <w:pPr>
+              <w:spacing w:after="0"/>
+            </w:pPr>
+            <w:r>
+              <w:rPr>
+                <w:rFonts w:ascii="Arial" w:hAnsi="Arial"/>
+                <w:sz w:val="16"/>
+              </w:rPr>
+            </w:r>
             <w:r>
               <w:rPr>
                 <w:rFonts w:ascii="Arial" w:hAnsi="Arial"/>
@@ -200,11 +324,19 @@
       <w:tr>
         <w:tc>
           <w:tcPr>
-            <w:tcW w:type="dxa" w:w="2628"/>
+            <w:tcW w:type="dxa" w:w="2091"/>
             <w:vAlign w:val="center"/>
           </w:tcPr>
           <w:p>
-            <w:r/>
+            <w:pPr>
+              <w:spacing w:after="0"/>
+            </w:pPr>
+            <w:r>
+              <w:rPr>
+                <w:rFonts w:ascii="Arial" w:hAnsi="Arial"/>
+                <w:sz w:val="16"/>
+              </w:rPr>
+            </w:r>
             <w:r>
               <w:rPr>
                 <w:rFonts w:ascii="Arial" w:hAnsi="Arial"/>
@@ -217,45 +349,94 @@
         </w:tc>
         <w:tc>
           <w:tcPr>
-            <w:tcW w:type="dxa" w:w="2628"/>
+            <w:tcW w:type="dxa" w:w="2091"/>
             <w:vAlign w:val="center"/>
           </w:tcPr>
           <w:p>
-            <w:r/>
+            <w:pPr>
+              <w:spacing w:after="0"/>
+            </w:pPr>
+            <w:r>
+              <w:rPr>
+                <w:rFonts w:ascii="Arial" w:hAnsi="Arial"/>
+                <w:sz w:val="16"/>
+              </w:rPr>
+            </w:r>
             <w:r>
               <w:rPr>
                 <w:rFonts w:ascii="Arial" w:hAnsi="Arial"/>
                 <w:b w:val="0"/>
                 <w:sz w:val="16"/>
               </w:rPr>
-              <w:t>Joint-action neural Q-learning; Discrete(1331)</w:t>
+              <w:t>Joint-action neural Q-learning</w:t>
             </w:r>
           </w:p>
         </w:tc>
         <w:tc>
           <w:tcPr>
-            <w:tcW w:type="dxa" w:w="2628"/>
+            <w:tcW w:type="dxa" w:w="2091"/>
             <w:vAlign w:val="center"/>
           </w:tcPr>
           <w:p>
-            <w:r/>
+            <w:pPr>
+              <w:spacing w:after="0"/>
+            </w:pPr>
+            <w:r>
+              <w:rPr>
+                <w:rFonts w:ascii="Arial" w:hAnsi="Arial"/>
+                <w:sz w:val="16"/>
+              </w:rPr>
+            </w:r>
             <w:r>
               <w:rPr>
                 <w:rFonts w:ascii="Arial" w:hAnsi="Arial"/>
                 <w:b w:val="0"/>
                 <w:sz w:val="16"/>
               </w:rPr>
-              <w:t>150K; lr=5e-4; 256x256</w:t>
+              <w:t>35-D hand-engineered; 1331 actions</w:t>
             </w:r>
           </w:p>
         </w:tc>
         <w:tc>
           <w:tcPr>
-            <w:tcW w:type="dxa" w:w="2628"/>
+            <w:tcW w:type="dxa" w:w="2091"/>
             <w:vAlign w:val="center"/>
           </w:tcPr>
           <w:p>
-            <w:r/>
+            <w:pPr>
+              <w:spacing w:after="0"/>
+            </w:pPr>
+            <w:r>
+              <w:rPr>
+                <w:rFonts w:ascii="Arial" w:hAnsi="Arial"/>
+                <w:sz w:val="16"/>
+              </w:rPr>
+            </w:r>
+            <w:r>
+              <w:rPr>
+                <w:rFonts w:ascii="Arial" w:hAnsi="Arial"/>
+                <w:b w:val="0"/>
+                <w:sz w:val="16"/>
+              </w:rPr>
+              <w:t>150K; lr 5e-4; 256x256</w:t>
+            </w:r>
+          </w:p>
+        </w:tc>
+        <w:tc>
+          <w:tcPr>
+            <w:tcW w:type="dxa" w:w="2091"/>
+            <w:vAlign w:val="center"/>
+          </w:tcPr>
+          <w:p>
+            <w:pPr>
+              <w:spacing w:after="0"/>
+            </w:pPr>
+            <w:r>
+              <w:rPr>
+                <w:rFonts w:ascii="Arial" w:hAnsi="Arial"/>
+                <w:sz w:val="16"/>
+              </w:rPr>
+            </w:r>
             <w:r>
               <w:rPr>
                 <w:rFonts w:ascii="Arial" w:hAnsi="Arial"/>
@@ -270,62 +451,119 @@
       <w:tr>
         <w:tc>
           <w:tcPr>
-            <w:tcW w:type="dxa" w:w="2628"/>
+            <w:tcW w:type="dxa" w:w="2091"/>
             <w:vAlign w:val="center"/>
           </w:tcPr>
           <w:p>
-            <w:r/>
+            <w:pPr>
+              <w:spacing w:after="0"/>
+            </w:pPr>
+            <w:r>
+              <w:rPr>
+                <w:rFonts w:ascii="Arial" w:hAnsi="Arial"/>
+                <w:sz w:val="16"/>
+              </w:rPr>
+            </w:r>
             <w:r>
               <w:rPr>
                 <w:rFonts w:ascii="Arial" w:hAnsi="Arial"/>
                 <w:b w:val="0"/>
                 <w:sz w:val="16"/>
               </w:rPr>
-              <w:t>Neural Network SARSA</w:t>
+              <w:t>Neural SARSA</w:t>
             </w:r>
           </w:p>
         </w:tc>
         <w:tc>
           <w:tcPr>
-            <w:tcW w:type="dxa" w:w="2628"/>
+            <w:tcW w:type="dxa" w:w="2091"/>
             <w:vAlign w:val="center"/>
           </w:tcPr>
           <w:p>
-            <w:r/>
+            <w:pPr>
+              <w:spacing w:after="0"/>
+            </w:pPr>
+            <w:r>
+              <w:rPr>
+                <w:rFonts w:ascii="Arial" w:hAnsi="Arial"/>
+                <w:sz w:val="16"/>
+              </w:rPr>
+            </w:r>
             <w:r>
               <w:rPr>
                 <w:rFonts w:ascii="Arial" w:hAnsi="Arial"/>
                 <w:b w:val="0"/>
                 <w:sz w:val="16"/>
               </w:rPr>
-              <w:t>True SARSA target; replay stores actual next behavior action; Rep-B</w:t>
+              <w:t>True SARSA target; replay of actual next action</w:t>
             </w:r>
           </w:p>
         </w:tc>
         <w:tc>
           <w:tcPr>
-            <w:tcW w:type="dxa" w:w="2628"/>
+            <w:tcW w:type="dxa" w:w="2091"/>
             <w:vAlign w:val="center"/>
           </w:tcPr>
           <w:p>
-            <w:r/>
+            <w:pPr>
+              <w:spacing w:after="0"/>
+            </w:pPr>
+            <w:r>
+              <w:rPr>
+                <w:rFonts w:ascii="Arial" w:hAnsi="Arial"/>
+                <w:sz w:val="16"/>
+              </w:rPr>
+            </w:r>
             <w:r>
               <w:rPr>
                 <w:rFonts w:ascii="Arial" w:hAnsi="Arial"/>
                 <w:b w:val="0"/>
                 <w:sz w:val="16"/>
               </w:rPr>
-              <w:t>500K; lr=3e-4; gamma=.98; seed 20260825</w:t>
+              <w:t>76-D Representation B; 1331 actions</w:t>
             </w:r>
           </w:p>
         </w:tc>
         <w:tc>
           <w:tcPr>
-            <w:tcW w:type="dxa" w:w="2628"/>
+            <w:tcW w:type="dxa" w:w="2091"/>
             <w:vAlign w:val="center"/>
           </w:tcPr>
           <w:p>
-            <w:r/>
+            <w:pPr>
+              <w:spacing w:after="0"/>
+            </w:pPr>
+            <w:r>
+              <w:rPr>
+                <w:rFonts w:ascii="Arial" w:hAnsi="Arial"/>
+                <w:sz w:val="16"/>
+              </w:rPr>
+            </w:r>
+            <w:r>
+              <w:rPr>
+                <w:rFonts w:ascii="Arial" w:hAnsi="Arial"/>
+                <w:b w:val="0"/>
+                <w:sz w:val="16"/>
+              </w:rPr>
+              <w:t>500K; lr 3e-4; gamma .98; seed 20260825</w:t>
+            </w:r>
+          </w:p>
+        </w:tc>
+        <w:tc>
+          <w:tcPr>
+            <w:tcW w:type="dxa" w:w="2091"/>
+            <w:vAlign w:val="center"/>
+          </w:tcPr>
+          <w:p>
+            <w:pPr>
+              <w:spacing w:after="0"/>
+            </w:pPr>
+            <w:r>
+              <w:rPr>
+                <w:rFonts w:ascii="Arial" w:hAnsi="Arial"/>
+                <w:sz w:val="16"/>
+              </w:rPr>
+            </w:r>
             <w:r>
               <w:rPr>
                 <w:rFonts w:ascii="Arial" w:hAnsi="Arial"/>
@@ -340,11 +578,19 @@
       <w:tr>
         <w:tc>
           <w:tcPr>
-            <w:tcW w:type="dxa" w:w="2628"/>
+            <w:tcW w:type="dxa" w:w="2091"/>
             <w:vAlign w:val="center"/>
           </w:tcPr>
           <w:p>
-            <w:r/>
+            <w:pPr>
+              <w:spacing w:after="0"/>
+            </w:pPr>
+            <w:r>
+              <w:rPr>
+                <w:rFonts w:ascii="Arial" w:hAnsi="Arial"/>
+                <w:sz w:val="16"/>
+              </w:rPr>
+            </w:r>
             <w:r>
               <w:rPr>
                 <w:rFonts w:ascii="Arial" w:hAnsi="Arial"/>
@@ -357,52 +603,101 @@
         </w:tc>
         <w:tc>
           <w:tcPr>
-            <w:tcW w:type="dxa" w:w="2628"/>
+            <w:tcW w:type="dxa" w:w="2091"/>
             <w:vAlign w:val="center"/>
           </w:tcPr>
           <w:p>
-            <w:r/>
+            <w:pPr>
+              <w:spacing w:after="0"/>
+            </w:pPr>
+            <w:r>
+              <w:rPr>
+                <w:rFonts w:ascii="Arial" w:hAnsi="Arial"/>
+                <w:sz w:val="16"/>
+              </w:rPr>
+            </w:r>
             <w:r>
               <w:rPr>
                 <w:rFonts w:ascii="Arial" w:hAnsi="Arial"/>
                 <w:b w:val="0"/>
                 <w:sz w:val="16"/>
               </w:rPr>
-              <w:t>Synchronous actor-critic; MultiDiscrete action space</w:t>
+              <w:t>Synchronous actor-critic; MultiDiscrete</w:t>
             </w:r>
           </w:p>
         </w:tc>
         <w:tc>
           <w:tcPr>
-            <w:tcW w:type="dxa" w:w="2628"/>
+            <w:tcW w:type="dxa" w:w="2091"/>
             <w:vAlign w:val="center"/>
           </w:tcPr>
           <w:p>
-            <w:r/>
+            <w:pPr>
+              <w:spacing w:after="0"/>
+            </w:pPr>
+            <w:r>
+              <w:rPr>
+                <w:rFonts w:ascii="Arial" w:hAnsi="Arial"/>
+                <w:sz w:val="16"/>
+              </w:rPr>
+            </w:r>
             <w:r>
               <w:rPr>
                 <w:rFonts w:ascii="Arial" w:hAnsi="Arial"/>
                 <w:b w:val="0"/>
                 <w:sz w:val="16"/>
               </w:rPr>
-              <w:t>200K; lr=7e-4; 128x128</w:t>
+              <w:t>99-D Representation C</w:t>
             </w:r>
           </w:p>
         </w:tc>
         <w:tc>
           <w:tcPr>
-            <w:tcW w:type="dxa" w:w="2628"/>
+            <w:tcW w:type="dxa" w:w="2091"/>
             <w:vAlign w:val="center"/>
           </w:tcPr>
           <w:p>
-            <w:r/>
+            <w:pPr>
+              <w:spacing w:after="0"/>
+            </w:pPr>
+            <w:r>
+              <w:rPr>
+                <w:rFonts w:ascii="Arial" w:hAnsi="Arial"/>
+                <w:sz w:val="16"/>
+              </w:rPr>
+            </w:r>
             <w:r>
               <w:rPr>
                 <w:rFonts w:ascii="Arial" w:hAnsi="Arial"/>
                 <w:b w:val="0"/>
                 <w:sz w:val="16"/>
               </w:rPr>
-              <w:t>114,047.62</w:t>
+              <w:t>500K; lr 5e-4; gamma .99; 256x256</w:t>
+            </w:r>
+          </w:p>
+        </w:tc>
+        <w:tc>
+          <w:tcPr>
+            <w:tcW w:type="dxa" w:w="2091"/>
+            <w:vAlign w:val="center"/>
+          </w:tcPr>
+          <w:p>
+            <w:pPr>
+              <w:spacing w:after="0"/>
+            </w:pPr>
+            <w:r>
+              <w:rPr>
+                <w:rFonts w:ascii="Arial" w:hAnsi="Arial"/>
+                <w:sz w:val="16"/>
+              </w:rPr>
+            </w:r>
+            <w:r>
+              <w:rPr>
+                <w:rFonts w:ascii="Arial" w:hAnsi="Arial"/>
+                <w:b w:val="0"/>
+                <w:sz w:val="16"/>
+              </w:rPr>
+              <w:t>94,660.12</w:t>
             </w:r>
           </w:p>
         </w:tc>
@@ -410,11 +705,19 @@
       <w:tr>
         <w:tc>
           <w:tcPr>
-            <w:tcW w:type="dxa" w:w="2628"/>
+            <w:tcW w:type="dxa" w:w="2091"/>
             <w:vAlign w:val="center"/>
           </w:tcPr>
           <w:p>
-            <w:r/>
+            <w:pPr>
+              <w:spacing w:after="0"/>
+            </w:pPr>
+            <w:r>
+              <w:rPr>
+                <w:rFonts w:ascii="Arial" w:hAnsi="Arial"/>
+                <w:sz w:val="16"/>
+              </w:rPr>
+            </w:r>
             <w:r>
               <w:rPr>
                 <w:rFonts w:ascii="Arial" w:hAnsi="Arial"/>
@@ -427,52 +730,101 @@
         </w:tc>
         <w:tc>
           <w:tcPr>
-            <w:tcW w:type="dxa" w:w="2628"/>
+            <w:tcW w:type="dxa" w:w="2091"/>
             <w:vAlign w:val="center"/>
           </w:tcPr>
           <w:p>
-            <w:r/>
+            <w:pPr>
+              <w:spacing w:after="0"/>
+            </w:pPr>
+            <w:r>
+              <w:rPr>
+                <w:rFonts w:ascii="Arial" w:hAnsi="Arial"/>
+                <w:sz w:val="16"/>
+              </w:rPr>
+            </w:r>
             <w:r>
               <w:rPr>
                 <w:rFonts w:ascii="Arial" w:hAnsi="Arial"/>
                 <w:b w:val="0"/>
                 <w:sz w:val="16"/>
               </w:rPr>
-              <w:t>Online next-action selection + target evaluation with a 256x256 dueling joint-action network</w:t>
+              <w:t>Online argmax + target evaluation</w:t>
             </w:r>
           </w:p>
         </w:tc>
         <w:tc>
           <w:tcPr>
-            <w:tcW w:type="dxa" w:w="2628"/>
+            <w:tcW w:type="dxa" w:w="2091"/>
             <w:vAlign w:val="center"/>
           </w:tcPr>
           <w:p>
-            <w:r/>
+            <w:pPr>
+              <w:spacing w:after="0"/>
+            </w:pPr>
+            <w:r>
+              <w:rPr>
+                <w:rFonts w:ascii="Arial" w:hAnsi="Arial"/>
+                <w:sz w:val="16"/>
+              </w:rPr>
+            </w:r>
             <w:r>
               <w:rPr>
                 <w:rFonts w:ascii="Arial" w:hAnsi="Arial"/>
                 <w:b w:val="0"/>
                 <w:sz w:val="16"/>
               </w:rPr>
-              <w:t>100K; lr=5e-4; gamma=.98; seed 20260727</w:t>
+              <w:t>35-D hand-engineered; 1331 actions</w:t>
             </w:r>
           </w:p>
         </w:tc>
         <w:tc>
           <w:tcPr>
-            <w:tcW w:type="dxa" w:w="2628"/>
+            <w:tcW w:type="dxa" w:w="2091"/>
             <w:vAlign w:val="center"/>
           </w:tcPr>
           <w:p>
-            <w:r/>
+            <w:pPr>
+              <w:spacing w:after="0"/>
+            </w:pPr>
+            <w:r>
+              <w:rPr>
+                <w:rFonts w:ascii="Arial" w:hAnsi="Arial"/>
+                <w:sz w:val="16"/>
+              </w:rPr>
+            </w:r>
             <w:r>
               <w:rPr>
                 <w:rFonts w:ascii="Arial" w:hAnsi="Arial"/>
                 <w:b w:val="0"/>
                 <w:sz w:val="16"/>
               </w:rPr>
-              <w:t>115,819.00 current; new local candidate 111,216.54</w:t>
+              <w:t>100K; lr 5e-4; gamma .98; 256x256</w:t>
+            </w:r>
+          </w:p>
+        </w:tc>
+        <w:tc>
+          <w:tcPr>
+            <w:tcW w:type="dxa" w:w="2091"/>
+            <w:vAlign w:val="center"/>
+          </w:tcPr>
+          <w:p>
+            <w:pPr>
+              <w:spacing w:after="0"/>
+            </w:pPr>
+            <w:r>
+              <w:rPr>
+                <w:rFonts w:ascii="Arial" w:hAnsi="Arial"/>
+                <w:sz w:val="16"/>
+              </w:rPr>
+            </w:r>
+            <w:r>
+              <w:rPr>
+                <w:rFonts w:ascii="Arial" w:hAnsi="Arial"/>
+                <w:b w:val="0"/>
+                <w:sz w:val="16"/>
+              </w:rPr>
+              <w:t>115,819.00</w:t>
             </w:r>
           </w:p>
         </w:tc>
@@ -481,43 +833,75 @@
     <w:p>
       <w:pPr>
         <w:pStyle w:val="Heading1"/>
+        <w:spacing w:before="100" w:after="60"/>
       </w:pPr>
       <w:r>
-        <w:t>2. Experimental Approach</w:t>
+        <w:t>2. Experimental approach</w:t>
       </w:r>
     </w:p>
     <w:p>
       <w:pPr>
-        <w:pStyle w:val="Heading2"/>
+        <w:spacing w:after="60"/>
+        <w:jc w:val="left"/>
       </w:pPr>
       <w:r>
-        <w:t>State and action representation</w:t>
-      </w:r>
-    </w:p>
-    <w:p>
-      <w:r>
-        <w:t>The official observation contains current inventory, the four-day arrival pipeline, seven-day demand history, day index and capacity utilisation. Representation B concatenates 38 normalized raw features with 38 engineered features covering inventory position, recent demand statistics, demand trend and variability, lead-time pipeline quantities, lead-time demand, inventory-position gap, days of supply, and capacity/horizon signals. Early-episode zero padding is excluded from real-history statistics. The external policy interface returns three quantities in {0,10,...,100}; the DQN family uses the full 1,331 joint action space internally via base-11 encoding.</w:t>
+        <w:rPr>
+          <w:rFonts w:ascii="Arial" w:hAnsi="Arial"/>
+          <w:b w:val="0"/>
+          <w:sz w:val="18"/>
+        </w:rPr>
+        <w:t>The official observation contains current inventory, the four-day arrival pipeline, seven-day demand history, day index and capacity utilisation. External policies return exactly three quantities in {0,10,...,100}; the DQN-family joint-action methods use the 11 x 11 x 11 action catalogue. The supplied environment, official cost function and leaderboard evaluator were not modified.</w:t>
       </w:r>
     </w:p>
     <w:p>
       <w:pPr>
-        <w:pStyle w:val="Heading2"/>
+        <w:spacing w:after="60"/>
+        <w:jc w:val="left"/>
       </w:pPr>
       <w:r>
-        <w:t>Reward and validation</w:t>
+        <w:rPr>
+          <w:rFonts w:ascii="Arial" w:hAnsi="Arial"/>
+          <w:b w:val="0"/>
+          <w:sz w:val="18"/>
+        </w:rPr>
+        <w:t>Representation B combines 38 normalized raw features with 38 engineered inventory-control features: inventory position, recent demand statistics, trend/variability, lead-time pipeline quantities, lead-time demand, inventory-position gap, days of supply, and capacity/horizon signals. Early zero-padding is excluded from demand-history statistics. Representation C adds EWMA demand, slope, demand CV, recent extrema, lead-time demand uncertainty, safety-stock and weekly phase signals.</w:t>
       </w:r>
     </w:p>
     <w:p>
+      <w:pPr>
+        <w:spacing w:after="60"/>
+        <w:jc w:val="left"/>
+      </w:pPr>
       <w:r>
-        <w:t>The official reward is negative daily total cost divided by 100. Training-time ShapedReward adds dense stockout, capacity/discarding and mild batching terms and anneals them to zero. All local validation and leaderboard numbers use the official unshaped cost. Local validation used the supplied environment with held-out seeds and the declared scenario modes. The final Double DQN candidate was evaluated over 200 episodes and achieved mean cost 111,216.54, standard deviation 14,914.34 and mean service level 0.980340.</w:t>
+        <w:rPr>
+          <w:rFonts w:ascii="Arial" w:hAnsi="Arial"/>
+          <w:b w:val="0"/>
+          <w:sz w:val="18"/>
+        </w:rPr>
+        <w:t>The official reward is negative daily total cost divided by 100. Where used, ShapedReward is training-only and annealed to zero. All reported local and public metrics use official unshaped cost. The local official-style holdout is 40 seeds (900-939) across stationary, seasonal, trend, shock and random scenarios, totaling 200 episodes.</w:t>
       </w:r>
     </w:p>
     <w:p>
       <w:pPr>
         <w:pStyle w:val="Heading1"/>
+        <w:spacing w:before="100" w:after="60"/>
       </w:pPr>
       <w:r>
         <w:t>3. Results</w:t>
+      </w:r>
+    </w:p>
+    <w:p>
+      <w:pPr>
+        <w:spacing w:after="60"/>
+        <w:jc w:val="left"/>
+      </w:pPr>
+      <w:r>
+        <w:rPr>
+          <w:rFonts w:ascii="Arial" w:hAnsi="Arial"/>
+          <w:b w:val="0"/>
+          <w:sz w:val="18"/>
+        </w:rPr>
+        <w:t>The final public Top-5 average is 99,566.57. The A2C slot was improved by replacing the previous A2C public result of 114,047.62 with the Representation C policy scoring 94,660.12 publicly and 94,180.86 on the official 200-episode local holdout.</w:t>
       </w:r>
     </w:p>
     <w:tbl>
@@ -528,21 +912,28 @@
         <w:tblLook w:firstColumn="1" w:firstRow="1" w:lastColumn="0" w:lastRow="0" w:noHBand="0" w:noVBand="1" w:val="04A0"/>
       </w:tblPr>
       <w:tblGrid>
-        <w:gridCol w:w="2102"/>
-        <w:gridCol w:w="2102"/>
-        <w:gridCol w:w="2102"/>
-        <w:gridCol w:w="2102"/>
-        <w:gridCol w:w="2102"/>
+        <w:gridCol w:w="2091"/>
+        <w:gridCol w:w="2091"/>
+        <w:gridCol w:w="2091"/>
+        <w:gridCol w:w="2091"/>
+        <w:gridCol w:w="2091"/>
       </w:tblGrid>
       <w:tr>
         <w:tc>
           <w:tcPr>
-            <w:tcW w:type="dxa" w:w="2102"/>
+            <w:tcW w:type="dxa" w:w="2091"/>
             <w:vAlign w:val="center"/>
-            <w:shd w:fill="D9EAF7"/>
           </w:tcPr>
           <w:p>
-            <w:r/>
+            <w:pPr>
+              <w:spacing w:after="0"/>
+            </w:pPr>
+            <w:r>
+              <w:rPr>
+                <w:rFonts w:ascii="Arial" w:hAnsi="Arial"/>
+                <w:sz w:val="16"/>
+              </w:rPr>
+            </w:r>
             <w:r>
               <w:rPr>
                 <w:rFonts w:ascii="Arial" w:hAnsi="Arial"/>
@@ -555,30 +946,69 @@
         </w:tc>
         <w:tc>
           <w:tcPr>
-            <w:tcW w:type="dxa" w:w="2102"/>
+            <w:tcW w:type="dxa" w:w="2091"/>
             <w:vAlign w:val="center"/>
-            <w:shd w:fill="D9EAF7"/>
           </w:tcPr>
           <w:p>
-            <w:r/>
+            <w:pPr>
+              <w:spacing w:after="0"/>
+            </w:pPr>
+            <w:r>
+              <w:rPr>
+                <w:rFonts w:ascii="Arial" w:hAnsi="Arial"/>
+                <w:sz w:val="16"/>
+              </w:rPr>
+            </w:r>
             <w:r>
               <w:rPr>
                 <w:rFonts w:ascii="Arial" w:hAnsi="Arial"/>
                 <w:b/>
                 <w:sz w:val="16"/>
               </w:rPr>
-              <w:t>Local mean cost</w:t>
+              <w:t>Public score</w:t>
             </w:r>
           </w:p>
         </w:tc>
         <w:tc>
           <w:tcPr>
-            <w:tcW w:type="dxa" w:w="2102"/>
+            <w:tcW w:type="dxa" w:w="2091"/>
             <w:vAlign w:val="center"/>
-            <w:shd w:fill="D9EAF7"/>
           </w:tcPr>
           <w:p>
-            <w:r/>
+            <w:pPr>
+              <w:spacing w:after="0"/>
+            </w:pPr>
+            <w:r>
+              <w:rPr>
+                <w:rFonts w:ascii="Arial" w:hAnsi="Arial"/>
+                <w:sz w:val="16"/>
+              </w:rPr>
+            </w:r>
+            <w:r>
+              <w:rPr>
+                <w:rFonts w:ascii="Arial" w:hAnsi="Arial"/>
+                <w:b/>
+                <w:sz w:val="16"/>
+              </w:rPr>
+              <w:t>Local mean</w:t>
+            </w:r>
+          </w:p>
+        </w:tc>
+        <w:tc>
+          <w:tcPr>
+            <w:tcW w:type="dxa" w:w="2091"/>
+            <w:vAlign w:val="center"/>
+          </w:tcPr>
+          <w:p>
+            <w:pPr>
+              <w:spacing w:after="0"/>
+            </w:pPr>
+            <w:r>
+              <w:rPr>
+                <w:rFonts w:ascii="Arial" w:hAnsi="Arial"/>
+                <w:sz w:val="16"/>
+              </w:rPr>
+            </w:r>
             <w:r>
               <w:rPr>
                 <w:rFonts w:ascii="Arial" w:hAnsi="Arial"/>
@@ -591,571 +1021,19 @@
         </w:tc>
         <w:tc>
           <w:tcPr>
-            <w:tcW w:type="dxa" w:w="2102"/>
+            <w:tcW w:type="dxa" w:w="2091"/>
             <w:vAlign w:val="center"/>
-            <w:shd w:fill="D9EAF7"/>
           </w:tcPr>
           <w:p>
-            <w:r/>
+            <w:pPr>
+              <w:spacing w:after="0"/>
+            </w:pPr>
             <w:r>
               <w:rPr>
                 <w:rFonts w:ascii="Arial" w:hAnsi="Arial"/>
-                <w:b/>
                 <w:sz w:val="16"/>
               </w:rPr>
-              <w:t>Service</w:t>
             </w:r>
-          </w:p>
-        </w:tc>
-        <w:tc>
-          <w:tcPr>
-            <w:tcW w:type="dxa" w:w="2102"/>
-            <w:vAlign w:val="center"/>
-            <w:shd w:fill="D9EAF7"/>
-          </w:tcPr>
-          <w:p>
-            <w:r/>
-            <w:r>
-              <w:rPr>
-                <w:rFonts w:ascii="Arial" w:hAnsi="Arial"/>
-                <w:b/>
-                <w:sz w:val="16"/>
-              </w:rPr>
-              <w:t>Status</w:t>
-            </w:r>
-          </w:p>
-        </w:tc>
-      </w:tr>
-      <w:tr>
-        <w:tc>
-          <w:tcPr>
-            <w:tcW w:type="dxa" w:w="2102"/>
-            <w:vAlign w:val="center"/>
-          </w:tcPr>
-          <w:p>
-            <w:r/>
-            <w:r>
-              <w:rPr>
-                <w:rFonts w:ascii="Arial" w:hAnsi="Arial"/>
-                <w:b w:val="0"/>
-                <w:sz w:val="16"/>
-              </w:rPr>
-              <w:t>PPO + Rep-B</w:t>
-            </w:r>
-          </w:p>
-        </w:tc>
-        <w:tc>
-          <w:tcPr>
-            <w:tcW w:type="dxa" w:w="2102"/>
-            <w:vAlign w:val="center"/>
-          </w:tcPr>
-          <w:p>
-            <w:r/>
-            <w:r>
-              <w:rPr>
-                <w:rFonts w:ascii="Arial" w:hAnsi="Arial"/>
-                <w:b w:val="0"/>
-                <w:sz w:val="16"/>
-              </w:rPr>
-              <w:t>83,039.20</w:t>
-            </w:r>
-          </w:p>
-        </w:tc>
-        <w:tc>
-          <w:tcPr>
-            <w:tcW w:type="dxa" w:w="2102"/>
-            <w:vAlign w:val="center"/>
-          </w:tcPr>
-          <w:p>
-            <w:r/>
-            <w:r>
-              <w:rPr>
-                <w:rFonts w:ascii="Arial" w:hAnsi="Arial"/>
-                <w:b w:val="0"/>
-                <w:sz w:val="16"/>
-              </w:rPr>
-              <w:t>9,777.14</w:t>
-            </w:r>
-          </w:p>
-        </w:tc>
-        <w:tc>
-          <w:tcPr>
-            <w:tcW w:type="dxa" w:w="2102"/>
-            <w:vAlign w:val="center"/>
-          </w:tcPr>
-          <w:p>
-            <w:r/>
-            <w:r>
-              <w:rPr>
-                <w:rFonts w:ascii="Arial" w:hAnsi="Arial"/>
-                <w:b w:val="0"/>
-                <w:sz w:val="16"/>
-              </w:rPr>
-              <w:t>0.992973</w:t>
-            </w:r>
-          </w:p>
-        </w:tc>
-        <w:tc>
-          <w:tcPr>
-            <w:tcW w:type="dxa" w:w="2102"/>
-            <w:vAlign w:val="center"/>
-          </w:tcPr>
-          <w:p>
-            <w:r/>
-            <w:r>
-              <w:rPr>
-                <w:rFonts w:ascii="Arial" w:hAnsi="Arial"/>
-                <w:b w:val="0"/>
-                <w:sz w:val="16"/>
-              </w:rPr>
-              <w:t>Selected</w:t>
-            </w:r>
-          </w:p>
-        </w:tc>
-      </w:tr>
-      <w:tr>
-        <w:tc>
-          <w:tcPr>
-            <w:tcW w:type="dxa" w:w="2102"/>
-            <w:vAlign w:val="center"/>
-          </w:tcPr>
-          <w:p>
-            <w:r/>
-            <w:r>
-              <w:rPr>
-                <w:rFonts w:ascii="Arial" w:hAnsi="Arial"/>
-                <w:b w:val="0"/>
-                <w:sz w:val="16"/>
-              </w:rPr>
-              <w:t>DQN</w:t>
-            </w:r>
-          </w:p>
-        </w:tc>
-        <w:tc>
-          <w:tcPr>
-            <w:tcW w:type="dxa" w:w="2102"/>
-            <w:vAlign w:val="center"/>
-          </w:tcPr>
-          <w:p>
-            <w:r/>
-            <w:r>
-              <w:rPr>
-                <w:rFonts w:ascii="Arial" w:hAnsi="Arial"/>
-                <w:b w:val="0"/>
-                <w:sz w:val="16"/>
-              </w:rPr>
-              <w:t>96,871.30</w:t>
-            </w:r>
-          </w:p>
-        </w:tc>
-        <w:tc>
-          <w:tcPr>
-            <w:tcW w:type="dxa" w:w="2102"/>
-            <w:vAlign w:val="center"/>
-          </w:tcPr>
-          <w:p>
-            <w:r/>
-            <w:r>
-              <w:rPr>
-                <w:rFonts w:ascii="Arial" w:hAnsi="Arial"/>
-                <w:b w:val="0"/>
-                <w:sz w:val="16"/>
-              </w:rPr>
-              <w:t>11,858</w:t>
-            </w:r>
-          </w:p>
-        </w:tc>
-        <w:tc>
-          <w:tcPr>
-            <w:tcW w:type="dxa" w:w="2102"/>
-            <w:vAlign w:val="center"/>
-          </w:tcPr>
-          <w:p>
-            <w:r/>
-            <w:r>
-              <w:rPr>
-                <w:rFonts w:ascii="Arial" w:hAnsi="Arial"/>
-                <w:b w:val="0"/>
-                <w:sz w:val="16"/>
-              </w:rPr>
-              <w:t>0.988895</w:t>
-            </w:r>
-          </w:p>
-        </w:tc>
-        <w:tc>
-          <w:tcPr>
-            <w:tcW w:type="dxa" w:w="2102"/>
-            <w:vAlign w:val="center"/>
-          </w:tcPr>
-          <w:p>
-            <w:r/>
-            <w:r>
-              <w:rPr>
-                <w:rFonts w:ascii="Arial" w:hAnsi="Arial"/>
-                <w:b w:val="0"/>
-                <w:sz w:val="16"/>
-              </w:rPr>
-              <w:t>Selected</w:t>
-            </w:r>
-          </w:p>
-        </w:tc>
-      </w:tr>
-      <w:tr>
-        <w:tc>
-          <w:tcPr>
-            <w:tcW w:type="dxa" w:w="2102"/>
-            <w:vAlign w:val="center"/>
-          </w:tcPr>
-          <w:p>
-            <w:r/>
-            <w:r>
-              <w:rPr>
-                <w:rFonts w:ascii="Arial" w:hAnsi="Arial"/>
-                <w:b w:val="0"/>
-                <w:sz w:val="16"/>
-              </w:rPr>
-              <w:t>Neural Network SARSA</w:t>
-            </w:r>
-          </w:p>
-        </w:tc>
-        <w:tc>
-          <w:tcPr>
-            <w:tcW w:type="dxa" w:w="2102"/>
-            <w:vAlign w:val="center"/>
-          </w:tcPr>
-          <w:p>
-            <w:r/>
-            <w:r>
-              <w:rPr>
-                <w:rFonts w:ascii="Arial" w:hAnsi="Arial"/>
-                <w:b w:val="0"/>
-                <w:sz w:val="16"/>
-              </w:rPr>
-              <w:t>111,730.60</w:t>
-            </w:r>
-          </w:p>
-        </w:tc>
-        <w:tc>
-          <w:tcPr>
-            <w:tcW w:type="dxa" w:w="2102"/>
-            <w:vAlign w:val="center"/>
-          </w:tcPr>
-          <w:p>
-            <w:r/>
-            <w:r>
-              <w:rPr>
-                <w:rFonts w:ascii="Arial" w:hAnsi="Arial"/>
-                <w:b w:val="0"/>
-                <w:sz w:val="16"/>
-              </w:rPr>
-              <w:t>9,941</w:t>
-            </w:r>
-          </w:p>
-        </w:tc>
-        <w:tc>
-          <w:tcPr>
-            <w:tcW w:type="dxa" w:w="2102"/>
-            <w:vAlign w:val="center"/>
-          </w:tcPr>
-          <w:p>
-            <w:r/>
-            <w:r>
-              <w:rPr>
-                <w:rFonts w:ascii="Arial" w:hAnsi="Arial"/>
-                <w:b w:val="0"/>
-                <w:sz w:val="16"/>
-              </w:rPr>
-              <w:t>0.992882</w:t>
-            </w:r>
-          </w:p>
-        </w:tc>
-        <w:tc>
-          <w:tcPr>
-            <w:tcW w:type="dxa" w:w="2102"/>
-            <w:vAlign w:val="center"/>
-          </w:tcPr>
-          <w:p>
-            <w:r/>
-            <w:r>
-              <w:rPr>
-                <w:rFonts w:ascii="Arial" w:hAnsi="Arial"/>
-                <w:b w:val="0"/>
-                <w:sz w:val="16"/>
-              </w:rPr>
-              <w:t>Selected</w:t>
-            </w:r>
-          </w:p>
-        </w:tc>
-      </w:tr>
-      <w:tr>
-        <w:tc>
-          <w:tcPr>
-            <w:tcW w:type="dxa" w:w="2102"/>
-            <w:vAlign w:val="center"/>
-          </w:tcPr>
-          <w:p>
-            <w:r/>
-            <w:r>
-              <w:rPr>
-                <w:rFonts w:ascii="Arial" w:hAnsi="Arial"/>
-                <w:b w:val="0"/>
-                <w:sz w:val="16"/>
-              </w:rPr>
-              <w:t>A2C</w:t>
-            </w:r>
-          </w:p>
-        </w:tc>
-        <w:tc>
-          <w:tcPr>
-            <w:tcW w:type="dxa" w:w="2102"/>
-            <w:vAlign w:val="center"/>
-          </w:tcPr>
-          <w:p>
-            <w:r/>
-            <w:r>
-              <w:rPr>
-                <w:rFonts w:ascii="Arial" w:hAnsi="Arial"/>
-                <w:b w:val="0"/>
-                <w:sz w:val="16"/>
-              </w:rPr>
-              <w:t>114,669.10</w:t>
-            </w:r>
-          </w:p>
-        </w:tc>
-        <w:tc>
-          <w:tcPr>
-            <w:tcW w:type="dxa" w:w="2102"/>
-            <w:vAlign w:val="center"/>
-          </w:tcPr>
-          <w:p>
-            <w:r/>
-            <w:r>
-              <w:rPr>
-                <w:rFonts w:ascii="Arial" w:hAnsi="Arial"/>
-                <w:b w:val="0"/>
-                <w:sz w:val="16"/>
-              </w:rPr>
-              <w:t>24,492</w:t>
-            </w:r>
-          </w:p>
-        </w:tc>
-        <w:tc>
-          <w:tcPr>
-            <w:tcW w:type="dxa" w:w="2102"/>
-            <w:vAlign w:val="center"/>
-          </w:tcPr>
-          <w:p>
-            <w:r/>
-            <w:r>
-              <w:rPr>
-                <w:rFonts w:ascii="Arial" w:hAnsi="Arial"/>
-                <w:b w:val="0"/>
-                <w:sz w:val="16"/>
-              </w:rPr>
-              <w:t>0.969282</w:t>
-            </w:r>
-          </w:p>
-        </w:tc>
-        <w:tc>
-          <w:tcPr>
-            <w:tcW w:type="dxa" w:w="2102"/>
-            <w:vAlign w:val="center"/>
-          </w:tcPr>
-          <w:p>
-            <w:r/>
-            <w:r>
-              <w:rPr>
-                <w:rFonts w:ascii="Arial" w:hAnsi="Arial"/>
-                <w:b w:val="0"/>
-                <w:sz w:val="16"/>
-              </w:rPr>
-              <w:t>Selected</w:t>
-            </w:r>
-          </w:p>
-        </w:tc>
-      </w:tr>
-      <w:tr>
-        <w:tc>
-          <w:tcPr>
-            <w:tcW w:type="dxa" w:w="2102"/>
-            <w:vAlign w:val="center"/>
-          </w:tcPr>
-          <w:p>
-            <w:r/>
-            <w:r>
-              <w:rPr>
-                <w:rFonts w:ascii="Arial" w:hAnsi="Arial"/>
-                <w:b w:val="0"/>
-                <w:sz w:val="16"/>
-              </w:rPr>
-              <w:t>Double DQN (dueling)</w:t>
-            </w:r>
-          </w:p>
-        </w:tc>
-        <w:tc>
-          <w:tcPr>
-            <w:tcW w:type="dxa" w:w="2102"/>
-            <w:vAlign w:val="center"/>
-          </w:tcPr>
-          <w:p>
-            <w:r/>
-            <w:r>
-              <w:rPr>
-                <w:rFonts w:ascii="Arial" w:hAnsi="Arial"/>
-                <w:b w:val="0"/>
-                <w:sz w:val="16"/>
-              </w:rPr>
-              <w:t>111,216.54</w:t>
-            </w:r>
-          </w:p>
-        </w:tc>
-        <w:tc>
-          <w:tcPr>
-            <w:tcW w:type="dxa" w:w="2102"/>
-            <w:vAlign w:val="center"/>
-          </w:tcPr>
-          <w:p>
-            <w:r/>
-            <w:r>
-              <w:rPr>
-                <w:rFonts w:ascii="Arial" w:hAnsi="Arial"/>
-                <w:b w:val="0"/>
-                <w:sz w:val="16"/>
-              </w:rPr>
-              <w:t>14,914.34</w:t>
-            </w:r>
-          </w:p>
-        </w:tc>
-        <w:tc>
-          <w:tcPr>
-            <w:tcW w:type="dxa" w:w="2102"/>
-            <w:vAlign w:val="center"/>
-          </w:tcPr>
-          <w:p>
-            <w:r/>
-            <w:r>
-              <w:rPr>
-                <w:rFonts w:ascii="Arial" w:hAnsi="Arial"/>
-                <w:b w:val="0"/>
-                <w:sz w:val="16"/>
-              </w:rPr>
-              <w:t>0.980340</w:t>
-            </w:r>
-          </w:p>
-        </w:tc>
-        <w:tc>
-          <w:tcPr>
-            <w:tcW w:type="dxa" w:w="2102"/>
-            <w:vAlign w:val="center"/>
-          </w:tcPr>
-          <w:p>
-            <w:r/>
-            <w:r>
-              <w:rPr>
-                <w:rFonts w:ascii="Arial" w:hAnsi="Arial"/>
-                <w:b w:val="0"/>
-                <w:sz w:val="16"/>
-              </w:rPr>
-              <w:t>Final portal candidate</w:t>
-            </w:r>
-          </w:p>
-        </w:tc>
-      </w:tr>
-    </w:tbl>
-    <w:p>
-      <w:r>
-        <w:t>Current published public scores give a Top-5 average cost of 103,444.07. The final Double DQN candidate is intended to replace the existing 115,819.00 Double DQN submission; its new public score is pending the last portal evaluation.</w:t>
-      </w:r>
-    </w:p>
-    <w:p>
-      <w:pPr>
-        <w:pStyle w:val="Heading1"/>
-      </w:pPr>
-      <w:r>
-        <w:t>4. Convergence and Scenario Evidence</w:t>
-      </w:r>
-    </w:p>
-    <w:p>
-      <w:r>
-        <w:t>Preserved training evaluation logs provide learning curves for PPO, DQN and A2C in the final notebook. For Neural Network SARSA and the final Double DQN candidate, the retained evidence is the 200-episode official local holdout plus scenario summaries. No unsupported convergence curve is fabricated.</w:t>
-      </w:r>
-    </w:p>
-    <w:tbl>
-      <w:tblPr>
-        <w:tblStyle w:val="TableGrid"/>
-        <w:tblW w:type="auto" w:w="0"/>
-        <w:jc w:val="center"/>
-        <w:tblLook w:firstColumn="1" w:firstRow="1" w:lastColumn="0" w:lastRow="0" w:noHBand="0" w:noVBand="1" w:val="04A0"/>
-      </w:tblPr>
-      <w:tblGrid>
-        <w:gridCol w:w="2628"/>
-        <w:gridCol w:w="2628"/>
-        <w:gridCol w:w="2628"/>
-        <w:gridCol w:w="2628"/>
-      </w:tblGrid>
-      <w:tr>
-        <w:tc>
-          <w:tcPr>
-            <w:tcW w:type="dxa" w:w="2628"/>
-            <w:vAlign w:val="center"/>
-            <w:shd w:fill="D9EAF7"/>
-          </w:tcPr>
-          <w:p>
-            <w:r/>
-            <w:r>
-              <w:rPr>
-                <w:rFonts w:ascii="Arial" w:hAnsi="Arial"/>
-                <w:b/>
-                <w:sz w:val="16"/>
-              </w:rPr>
-              <w:t>Candidate</w:t>
-            </w:r>
-          </w:p>
-        </w:tc>
-        <w:tc>
-          <w:tcPr>
-            <w:tcW w:type="dxa" w:w="2628"/>
-            <w:vAlign w:val="center"/>
-            <w:shd w:fill="D9EAF7"/>
-          </w:tcPr>
-          <w:p>
-            <w:r/>
-            <w:r>
-              <w:rPr>
-                <w:rFonts w:ascii="Arial" w:hAnsi="Arial"/>
-                <w:b/>
-                <w:sz w:val="16"/>
-              </w:rPr>
-              <w:t>Scenario</w:t>
-            </w:r>
-          </w:p>
-        </w:tc>
-        <w:tc>
-          <w:tcPr>
-            <w:tcW w:type="dxa" w:w="2628"/>
-            <w:vAlign w:val="center"/>
-            <w:shd w:fill="D9EAF7"/>
-          </w:tcPr>
-          <w:p>
-            <w:r/>
-            <w:r>
-              <w:rPr>
-                <w:rFonts w:ascii="Arial" w:hAnsi="Arial"/>
-                <w:b/>
-                <w:sz w:val="16"/>
-              </w:rPr>
-              <w:t>Mean cost</w:t>
-            </w:r>
-          </w:p>
-        </w:tc>
-        <w:tc>
-          <w:tcPr>
-            <w:tcW w:type="dxa" w:w="2628"/>
-            <w:vAlign w:val="center"/>
-            <w:shd w:fill="D9EAF7"/>
-          </w:tcPr>
-          <w:p>
-            <w:r/>
             <w:r>
               <w:rPr>
                 <w:rFonts w:ascii="Arial" w:hAnsi="Arial"/>
@@ -1170,69 +1048,126 @@
       <w:tr>
         <w:tc>
           <w:tcPr>
-            <w:tcW w:type="dxa" w:w="2628"/>
+            <w:tcW w:type="dxa" w:w="2091"/>
             <w:vAlign w:val="center"/>
           </w:tcPr>
           <w:p>
-            <w:r/>
+            <w:pPr>
+              <w:spacing w:after="0"/>
+            </w:pPr>
+            <w:r>
+              <w:rPr>
+                <w:rFonts w:ascii="Arial" w:hAnsi="Arial"/>
+                <w:sz w:val="16"/>
+              </w:rPr>
+            </w:r>
             <w:r>
               <w:rPr>
                 <w:rFonts w:ascii="Arial" w:hAnsi="Arial"/>
                 <w:b w:val="0"/>
                 <w:sz w:val="16"/>
               </w:rPr>
-              <w:t>PPO</w:t>
+              <w:t>PPO + Rep-B</w:t>
             </w:r>
           </w:p>
         </w:tc>
         <w:tc>
           <w:tcPr>
-            <w:tcW w:type="dxa" w:w="2628"/>
+            <w:tcW w:type="dxa" w:w="2091"/>
             <w:vAlign w:val="center"/>
           </w:tcPr>
           <w:p>
-            <w:r/>
+            <w:pPr>
+              <w:spacing w:after="0"/>
+            </w:pPr>
+            <w:r>
+              <w:rPr>
+                <w:rFonts w:ascii="Arial" w:hAnsi="Arial"/>
+                <w:sz w:val="16"/>
+              </w:rPr>
+            </w:r>
             <w:r>
               <w:rPr>
                 <w:rFonts w:ascii="Arial" w:hAnsi="Arial"/>
                 <w:b w:val="0"/>
                 <w:sz w:val="16"/>
               </w:rPr>
-              <w:t>Random</w:t>
+              <w:t>83,610.75</w:t>
             </w:r>
           </w:p>
         </w:tc>
         <w:tc>
           <w:tcPr>
-            <w:tcW w:type="dxa" w:w="2628"/>
+            <w:tcW w:type="dxa" w:w="2091"/>
             <w:vAlign w:val="center"/>
           </w:tcPr>
           <w:p>
-            <w:r/>
+            <w:pPr>
+              <w:spacing w:after="0"/>
+            </w:pPr>
+            <w:r>
+              <w:rPr>
+                <w:rFonts w:ascii="Arial" w:hAnsi="Arial"/>
+                <w:sz w:val="16"/>
+              </w:rPr>
+            </w:r>
             <w:r>
               <w:rPr>
                 <w:rFonts w:ascii="Arial" w:hAnsi="Arial"/>
                 <w:b w:val="0"/>
                 <w:sz w:val="16"/>
               </w:rPr>
-              <w:t>85,214.00</w:t>
+              <w:t>83,039.20</w:t>
             </w:r>
           </w:p>
         </w:tc>
         <w:tc>
           <w:tcPr>
-            <w:tcW w:type="dxa" w:w="2628"/>
+            <w:tcW w:type="dxa" w:w="2091"/>
             <w:vAlign w:val="center"/>
           </w:tcPr>
           <w:p>
-            <w:r/>
+            <w:pPr>
+              <w:spacing w:after="0"/>
+            </w:pPr>
+            <w:r>
+              <w:rPr>
+                <w:rFonts w:ascii="Arial" w:hAnsi="Arial"/>
+                <w:sz w:val="16"/>
+              </w:rPr>
+            </w:r>
             <w:r>
               <w:rPr>
                 <w:rFonts w:ascii="Arial" w:hAnsi="Arial"/>
                 <w:b w:val="0"/>
                 <w:sz w:val="16"/>
               </w:rPr>
-              <w:t>0.9919</w:t>
+              <w:t>9,777.14</w:t>
+            </w:r>
+          </w:p>
+        </w:tc>
+        <w:tc>
+          <w:tcPr>
+            <w:tcW w:type="dxa" w:w="2091"/>
+            <w:vAlign w:val="center"/>
+          </w:tcPr>
+          <w:p>
+            <w:pPr>
+              <w:spacing w:after="0"/>
+            </w:pPr>
+            <w:r>
+              <w:rPr>
+                <w:rFonts w:ascii="Arial" w:hAnsi="Arial"/>
+                <w:sz w:val="16"/>
+              </w:rPr>
+            </w:r>
+            <w:r>
+              <w:rPr>
+                <w:rFonts w:ascii="Arial" w:hAnsi="Arial"/>
+                <w:b w:val="0"/>
+                <w:sz w:val="16"/>
+              </w:rPr>
+              <w:t>0.992973</w:t>
             </w:r>
           </w:p>
         </w:tc>
@@ -1240,69 +1175,126 @@
       <w:tr>
         <w:tc>
           <w:tcPr>
-            <w:tcW w:type="dxa" w:w="2628"/>
+            <w:tcW w:type="dxa" w:w="2091"/>
             <w:vAlign w:val="center"/>
           </w:tcPr>
           <w:p>
-            <w:r/>
+            <w:pPr>
+              <w:spacing w:after="0"/>
+            </w:pPr>
+            <w:r>
+              <w:rPr>
+                <w:rFonts w:ascii="Arial" w:hAnsi="Arial"/>
+                <w:sz w:val="16"/>
+              </w:rPr>
+            </w:r>
             <w:r>
               <w:rPr>
                 <w:rFonts w:ascii="Arial" w:hAnsi="Arial"/>
                 <w:b w:val="0"/>
                 <w:sz w:val="16"/>
               </w:rPr>
-              <w:t>PPO</w:t>
+              <w:t>DQN</w:t>
             </w:r>
           </w:p>
         </w:tc>
         <w:tc>
           <w:tcPr>
-            <w:tcW w:type="dxa" w:w="2628"/>
+            <w:tcW w:type="dxa" w:w="2091"/>
             <w:vAlign w:val="center"/>
           </w:tcPr>
           <w:p>
-            <w:r/>
+            <w:pPr>
+              <w:spacing w:after="0"/>
+            </w:pPr>
+            <w:r>
+              <w:rPr>
+                <w:rFonts w:ascii="Arial" w:hAnsi="Arial"/>
+                <w:sz w:val="16"/>
+              </w:rPr>
+            </w:r>
             <w:r>
               <w:rPr>
                 <w:rFonts w:ascii="Arial" w:hAnsi="Arial"/>
                 <w:b w:val="0"/>
                 <w:sz w:val="16"/>
               </w:rPr>
-              <w:t>Seasonal</w:t>
+              <w:t>90,670.62</w:t>
             </w:r>
           </w:p>
         </w:tc>
         <w:tc>
           <w:tcPr>
-            <w:tcW w:type="dxa" w:w="2628"/>
+            <w:tcW w:type="dxa" w:w="2091"/>
             <w:vAlign w:val="center"/>
           </w:tcPr>
           <w:p>
-            <w:r/>
+            <w:pPr>
+              <w:spacing w:after="0"/>
+            </w:pPr>
+            <w:r>
+              <w:rPr>
+                <w:rFonts w:ascii="Arial" w:hAnsi="Arial"/>
+                <w:sz w:val="16"/>
+              </w:rPr>
+            </w:r>
             <w:r>
               <w:rPr>
                 <w:rFonts w:ascii="Arial" w:hAnsi="Arial"/>
                 <w:b w:val="0"/>
                 <w:sz w:val="16"/>
               </w:rPr>
-              <w:t>83,162.50</w:t>
+              <w:t>96,871.30</w:t>
             </w:r>
           </w:p>
         </w:tc>
         <w:tc>
           <w:tcPr>
-            <w:tcW w:type="dxa" w:w="2628"/>
+            <w:tcW w:type="dxa" w:w="2091"/>
             <w:vAlign w:val="center"/>
           </w:tcPr>
           <w:p>
-            <w:r/>
+            <w:pPr>
+              <w:spacing w:after="0"/>
+            </w:pPr>
+            <w:r>
+              <w:rPr>
+                <w:rFonts w:ascii="Arial" w:hAnsi="Arial"/>
+                <w:sz w:val="16"/>
+              </w:rPr>
+            </w:r>
             <w:r>
               <w:rPr>
                 <w:rFonts w:ascii="Arial" w:hAnsi="Arial"/>
                 <w:b w:val="0"/>
                 <w:sz w:val="16"/>
               </w:rPr>
-              <w:t>0.9935</w:t>
+              <w:t>11,858.00</w:t>
+            </w:r>
+          </w:p>
+        </w:tc>
+        <w:tc>
+          <w:tcPr>
+            <w:tcW w:type="dxa" w:w="2091"/>
+            <w:vAlign w:val="center"/>
+          </w:tcPr>
+          <w:p>
+            <w:pPr>
+              <w:spacing w:after="0"/>
+            </w:pPr>
+            <w:r>
+              <w:rPr>
+                <w:rFonts w:ascii="Arial" w:hAnsi="Arial"/>
+                <w:sz w:val="16"/>
+              </w:rPr>
+            </w:r>
+            <w:r>
+              <w:rPr>
+                <w:rFonts w:ascii="Arial" w:hAnsi="Arial"/>
+                <w:b w:val="0"/>
+                <w:sz w:val="16"/>
+              </w:rPr>
+              <w:t>0.988895</w:t>
             </w:r>
           </w:p>
         </w:tc>
@@ -1310,69 +1302,126 @@
       <w:tr>
         <w:tc>
           <w:tcPr>
-            <w:tcW w:type="dxa" w:w="2628"/>
+            <w:tcW w:type="dxa" w:w="2091"/>
             <w:vAlign w:val="center"/>
           </w:tcPr>
           <w:p>
-            <w:r/>
+            <w:pPr>
+              <w:spacing w:after="0"/>
+            </w:pPr>
+            <w:r>
+              <w:rPr>
+                <w:rFonts w:ascii="Arial" w:hAnsi="Arial"/>
+                <w:sz w:val="16"/>
+              </w:rPr>
+            </w:r>
             <w:r>
               <w:rPr>
                 <w:rFonts w:ascii="Arial" w:hAnsi="Arial"/>
                 <w:b w:val="0"/>
                 <w:sz w:val="16"/>
               </w:rPr>
-              <w:t>PPO</w:t>
+              <w:t>A2C + Rep-C</w:t>
             </w:r>
           </w:p>
         </w:tc>
         <w:tc>
           <w:tcPr>
-            <w:tcW w:type="dxa" w:w="2628"/>
+            <w:tcW w:type="dxa" w:w="2091"/>
             <w:vAlign w:val="center"/>
           </w:tcPr>
           <w:p>
-            <w:r/>
+            <w:pPr>
+              <w:spacing w:after="0"/>
+            </w:pPr>
+            <w:r>
+              <w:rPr>
+                <w:rFonts w:ascii="Arial" w:hAnsi="Arial"/>
+                <w:sz w:val="16"/>
+              </w:rPr>
+            </w:r>
             <w:r>
               <w:rPr>
                 <w:rFonts w:ascii="Arial" w:hAnsi="Arial"/>
                 <w:b w:val="0"/>
                 <w:sz w:val="16"/>
               </w:rPr>
-              <w:t>Shock</w:t>
+              <w:t>94,660.12</w:t>
             </w:r>
           </w:p>
         </w:tc>
         <w:tc>
           <w:tcPr>
-            <w:tcW w:type="dxa" w:w="2628"/>
+            <w:tcW w:type="dxa" w:w="2091"/>
             <w:vAlign w:val="center"/>
           </w:tcPr>
           <w:p>
-            <w:r/>
+            <w:pPr>
+              <w:spacing w:after="0"/>
+            </w:pPr>
+            <w:r>
+              <w:rPr>
+                <w:rFonts w:ascii="Arial" w:hAnsi="Arial"/>
+                <w:sz w:val="16"/>
+              </w:rPr>
+            </w:r>
             <w:r>
               <w:rPr>
                 <w:rFonts w:ascii="Arial" w:hAnsi="Arial"/>
                 <w:b w:val="0"/>
                 <w:sz w:val="16"/>
               </w:rPr>
-              <w:t>84,740.25</w:t>
+              <w:t>94,180.86</w:t>
             </w:r>
           </w:p>
         </w:tc>
         <w:tc>
           <w:tcPr>
-            <w:tcW w:type="dxa" w:w="2628"/>
+            <w:tcW w:type="dxa" w:w="2091"/>
             <w:vAlign w:val="center"/>
           </w:tcPr>
           <w:p>
-            <w:r/>
+            <w:pPr>
+              <w:spacing w:after="0"/>
+            </w:pPr>
+            <w:r>
+              <w:rPr>
+                <w:rFonts w:ascii="Arial" w:hAnsi="Arial"/>
+                <w:sz w:val="16"/>
+              </w:rPr>
+            </w:r>
             <w:r>
               <w:rPr>
                 <w:rFonts w:ascii="Arial" w:hAnsi="Arial"/>
                 <w:b w:val="0"/>
                 <w:sz w:val="16"/>
               </w:rPr>
-              <w:t>0.9916</w:t>
+              <w:t>7,961.56</w:t>
+            </w:r>
+          </w:p>
+        </w:tc>
+        <w:tc>
+          <w:tcPr>
+            <w:tcW w:type="dxa" w:w="2091"/>
+            <w:vAlign w:val="center"/>
+          </w:tcPr>
+          <w:p>
+            <w:pPr>
+              <w:spacing w:after="0"/>
+            </w:pPr>
+            <w:r>
+              <w:rPr>
+                <w:rFonts w:ascii="Arial" w:hAnsi="Arial"/>
+                <w:sz w:val="16"/>
+              </w:rPr>
+            </w:r>
+            <w:r>
+              <w:rPr>
+                <w:rFonts w:ascii="Arial" w:hAnsi="Arial"/>
+                <w:b w:val="0"/>
+                <w:sz w:val="16"/>
+              </w:rPr>
+              <w:t>0.994717</w:t>
             </w:r>
           </w:p>
         </w:tc>
@@ -1380,69 +1429,126 @@
       <w:tr>
         <w:tc>
           <w:tcPr>
-            <w:tcW w:type="dxa" w:w="2628"/>
+            <w:tcW w:type="dxa" w:w="2091"/>
             <w:vAlign w:val="center"/>
           </w:tcPr>
           <w:p>
-            <w:r/>
+            <w:pPr>
+              <w:spacing w:after="0"/>
+            </w:pPr>
+            <w:r>
+              <w:rPr>
+                <w:rFonts w:ascii="Arial" w:hAnsi="Arial"/>
+                <w:sz w:val="16"/>
+              </w:rPr>
+            </w:r>
             <w:r>
               <w:rPr>
                 <w:rFonts w:ascii="Arial" w:hAnsi="Arial"/>
                 <w:b w:val="0"/>
                 <w:sz w:val="16"/>
               </w:rPr>
-              <w:t>PPO</w:t>
+              <w:t>Neural Network SARSA</w:t>
             </w:r>
           </w:p>
         </w:tc>
         <w:tc>
           <w:tcPr>
-            <w:tcW w:type="dxa" w:w="2628"/>
+            <w:tcW w:type="dxa" w:w="2091"/>
             <w:vAlign w:val="center"/>
           </w:tcPr>
           <w:p>
-            <w:r/>
+            <w:pPr>
+              <w:spacing w:after="0"/>
+            </w:pPr>
+            <w:r>
+              <w:rPr>
+                <w:rFonts w:ascii="Arial" w:hAnsi="Arial"/>
+                <w:sz w:val="16"/>
+              </w:rPr>
+            </w:r>
             <w:r>
               <w:rPr>
                 <w:rFonts w:ascii="Arial" w:hAnsi="Arial"/>
                 <w:b w:val="0"/>
                 <w:sz w:val="16"/>
               </w:rPr>
-              <w:t>Stationary</w:t>
+              <w:t>113,072.38</w:t>
             </w:r>
           </w:p>
         </w:tc>
         <w:tc>
           <w:tcPr>
-            <w:tcW w:type="dxa" w:w="2628"/>
+            <w:tcW w:type="dxa" w:w="2091"/>
             <w:vAlign w:val="center"/>
           </w:tcPr>
           <w:p>
-            <w:r/>
+            <w:pPr>
+              <w:spacing w:after="0"/>
+            </w:pPr>
+            <w:r>
+              <w:rPr>
+                <w:rFonts w:ascii="Arial" w:hAnsi="Arial"/>
+                <w:sz w:val="16"/>
+              </w:rPr>
+            </w:r>
             <w:r>
               <w:rPr>
                 <w:rFonts w:ascii="Arial" w:hAnsi="Arial"/>
                 <w:b w:val="0"/>
                 <w:sz w:val="16"/>
               </w:rPr>
-              <w:t>82,806.25</w:t>
+              <w:t>111,730.60</w:t>
             </w:r>
           </w:p>
         </w:tc>
         <w:tc>
           <w:tcPr>
-            <w:tcW w:type="dxa" w:w="2628"/>
+            <w:tcW w:type="dxa" w:w="2091"/>
             <w:vAlign w:val="center"/>
           </w:tcPr>
           <w:p>
-            <w:r/>
+            <w:pPr>
+              <w:spacing w:after="0"/>
+            </w:pPr>
+            <w:r>
+              <w:rPr>
+                <w:rFonts w:ascii="Arial" w:hAnsi="Arial"/>
+                <w:sz w:val="16"/>
+              </w:rPr>
+            </w:r>
             <w:r>
               <w:rPr>
                 <w:rFonts w:ascii="Arial" w:hAnsi="Arial"/>
                 <w:b w:val="0"/>
                 <w:sz w:val="16"/>
               </w:rPr>
-              <w:t>0.9927</w:t>
+              <w:t>9,941.00</w:t>
+            </w:r>
+          </w:p>
+        </w:tc>
+        <w:tc>
+          <w:tcPr>
+            <w:tcW w:type="dxa" w:w="2091"/>
+            <w:vAlign w:val="center"/>
+          </w:tcPr>
+          <w:p>
+            <w:pPr>
+              <w:spacing w:after="0"/>
+            </w:pPr>
+            <w:r>
+              <w:rPr>
+                <w:rFonts w:ascii="Arial" w:hAnsi="Arial"/>
+                <w:sz w:val="16"/>
+              </w:rPr>
+            </w:r>
+            <w:r>
+              <w:rPr>
+                <w:rFonts w:ascii="Arial" w:hAnsi="Arial"/>
+                <w:b w:val="0"/>
+                <w:sz w:val="16"/>
+              </w:rPr>
+              <w:t>0.992882</w:t>
             </w:r>
           </w:p>
         </w:tc>
@@ -1450,419 +1556,126 @@
       <w:tr>
         <w:tc>
           <w:tcPr>
-            <w:tcW w:type="dxa" w:w="2628"/>
+            <w:tcW w:type="dxa" w:w="2091"/>
             <w:vAlign w:val="center"/>
           </w:tcPr>
           <w:p>
-            <w:r/>
+            <w:pPr>
+              <w:spacing w:after="0"/>
+            </w:pPr>
+            <w:r>
+              <w:rPr>
+                <w:rFonts w:ascii="Arial" w:hAnsi="Arial"/>
+                <w:sz w:val="16"/>
+              </w:rPr>
+            </w:r>
             <w:r>
               <w:rPr>
                 <w:rFonts w:ascii="Arial" w:hAnsi="Arial"/>
                 <w:b w:val="0"/>
                 <w:sz w:val="16"/>
               </w:rPr>
-              <w:t>PPO</w:t>
+              <w:t>Double DQN</w:t>
             </w:r>
           </w:p>
         </w:tc>
         <w:tc>
           <w:tcPr>
-            <w:tcW w:type="dxa" w:w="2628"/>
+            <w:tcW w:type="dxa" w:w="2091"/>
             <w:vAlign w:val="center"/>
           </w:tcPr>
           <w:p>
-            <w:r/>
+            <w:pPr>
+              <w:spacing w:after="0"/>
+            </w:pPr>
+            <w:r>
+              <w:rPr>
+                <w:rFonts w:ascii="Arial" w:hAnsi="Arial"/>
+                <w:sz w:val="16"/>
+              </w:rPr>
+            </w:r>
             <w:r>
               <w:rPr>
                 <w:rFonts w:ascii="Arial" w:hAnsi="Arial"/>
                 <w:b w:val="0"/>
                 <w:sz w:val="16"/>
               </w:rPr>
-              <w:t>Trend</w:t>
+              <w:t>115,819.00</w:t>
             </w:r>
           </w:p>
         </w:tc>
         <w:tc>
           <w:tcPr>
-            <w:tcW w:type="dxa" w:w="2628"/>
+            <w:tcW w:type="dxa" w:w="2091"/>
             <w:vAlign w:val="center"/>
           </w:tcPr>
           <w:p>
-            <w:r/>
+            <w:pPr>
+              <w:spacing w:after="0"/>
+            </w:pPr>
+            <w:r>
+              <w:rPr>
+                <w:rFonts w:ascii="Arial" w:hAnsi="Arial"/>
+                <w:sz w:val="16"/>
+              </w:rPr>
+            </w:r>
             <w:r>
               <w:rPr>
                 <w:rFonts w:ascii="Arial" w:hAnsi="Arial"/>
                 <w:b w:val="0"/>
                 <w:sz w:val="16"/>
               </w:rPr>
-              <w:t>79,273.00</w:t>
+              <w:t>N/A</w:t>
             </w:r>
           </w:p>
         </w:tc>
         <w:tc>
           <w:tcPr>
-            <w:tcW w:type="dxa" w:w="2628"/>
+            <w:tcW w:type="dxa" w:w="2091"/>
             <w:vAlign w:val="center"/>
           </w:tcPr>
           <w:p>
-            <w:r/>
+            <w:pPr>
+              <w:spacing w:after="0"/>
+            </w:pPr>
+            <w:r>
+              <w:rPr>
+                <w:rFonts w:ascii="Arial" w:hAnsi="Arial"/>
+                <w:sz w:val="16"/>
+              </w:rPr>
+            </w:r>
             <w:r>
               <w:rPr>
                 <w:rFonts w:ascii="Arial" w:hAnsi="Arial"/>
                 <w:b w:val="0"/>
                 <w:sz w:val="16"/>
               </w:rPr>
-              <w:t>0.9951</w:t>
+              <w:t>N/A</w:t>
             </w:r>
           </w:p>
         </w:tc>
-      </w:tr>
-      <w:tr>
         <w:tc>
           <w:tcPr>
-            <w:tcW w:type="dxa" w:w="2628"/>
+            <w:tcW w:type="dxa" w:w="2091"/>
             <w:vAlign w:val="center"/>
           </w:tcPr>
           <w:p>
-            <w:r/>
+            <w:pPr>
+              <w:spacing w:after="0"/>
+            </w:pPr>
+            <w:r>
+              <w:rPr>
+                <w:rFonts w:ascii="Arial" w:hAnsi="Arial"/>
+                <w:sz w:val="16"/>
+              </w:rPr>
+            </w:r>
             <w:r>
               <w:rPr>
                 <w:rFonts w:ascii="Arial" w:hAnsi="Arial"/>
                 <w:b w:val="0"/>
                 <w:sz w:val="16"/>
               </w:rPr>
-              <w:t>Double DQN (dueling)</w:t>
-            </w:r>
-          </w:p>
-        </w:tc>
-        <w:tc>
-          <w:tcPr>
-            <w:tcW w:type="dxa" w:w="2628"/>
-            <w:vAlign w:val="center"/>
-          </w:tcPr>
-          <w:p>
-            <w:r/>
-            <w:r>
-              <w:rPr>
-                <w:rFonts w:ascii="Arial" w:hAnsi="Arial"/>
-                <w:b w:val="0"/>
-                <w:sz w:val="16"/>
-              </w:rPr>
-              <w:t>Random</w:t>
-            </w:r>
-          </w:p>
-        </w:tc>
-        <w:tc>
-          <w:tcPr>
-            <w:tcW w:type="dxa" w:w="2628"/>
-            <w:vAlign w:val="center"/>
-          </w:tcPr>
-          <w:p>
-            <w:r/>
-            <w:r>
-              <w:rPr>
-                <w:rFonts w:ascii="Arial" w:hAnsi="Arial"/>
-                <w:b w:val="0"/>
-                <w:sz w:val="16"/>
-              </w:rPr>
-              <w:t>111,582.25</w:t>
-            </w:r>
-          </w:p>
-        </w:tc>
-        <w:tc>
-          <w:tcPr>
-            <w:tcW w:type="dxa" w:w="2628"/>
-            <w:vAlign w:val="center"/>
-          </w:tcPr>
-          <w:p>
-            <w:r/>
-            <w:r>
-              <w:rPr>
-                <w:rFonts w:ascii="Arial" w:hAnsi="Arial"/>
-                <w:b w:val="0"/>
-                <w:sz w:val="16"/>
-              </w:rPr>
-              <w:t>0.9797</w:t>
-            </w:r>
-          </w:p>
-        </w:tc>
-      </w:tr>
-      <w:tr>
-        <w:tc>
-          <w:tcPr>
-            <w:tcW w:type="dxa" w:w="2628"/>
-            <w:vAlign w:val="center"/>
-          </w:tcPr>
-          <w:p>
-            <w:r/>
-            <w:r>
-              <w:rPr>
-                <w:rFonts w:ascii="Arial" w:hAnsi="Arial"/>
-                <w:b w:val="0"/>
-                <w:sz w:val="16"/>
-              </w:rPr>
-              <w:t>Double DQN (dueling)</w:t>
-            </w:r>
-          </w:p>
-        </w:tc>
-        <w:tc>
-          <w:tcPr>
-            <w:tcW w:type="dxa" w:w="2628"/>
-            <w:vAlign w:val="center"/>
-          </w:tcPr>
-          <w:p>
-            <w:r/>
-            <w:r>
-              <w:rPr>
-                <w:rFonts w:ascii="Arial" w:hAnsi="Arial"/>
-                <w:b w:val="0"/>
-                <w:sz w:val="16"/>
-              </w:rPr>
-              <w:t>Seasonal</w:t>
-            </w:r>
-          </w:p>
-        </w:tc>
-        <w:tc>
-          <w:tcPr>
-            <w:tcW w:type="dxa" w:w="2628"/>
-            <w:vAlign w:val="center"/>
-          </w:tcPr>
-          <w:p>
-            <w:r/>
-            <w:r>
-              <w:rPr>
-                <w:rFonts w:ascii="Arial" w:hAnsi="Arial"/>
-                <w:b w:val="0"/>
-                <w:sz w:val="16"/>
-              </w:rPr>
-              <w:t>111,609.94</w:t>
-            </w:r>
-          </w:p>
-        </w:tc>
-        <w:tc>
-          <w:tcPr>
-            <w:tcW w:type="dxa" w:w="2628"/>
-            <w:vAlign w:val="center"/>
-          </w:tcPr>
-          <w:p>
-            <w:r/>
-            <w:r>
-              <w:rPr>
-                <w:rFonts w:ascii="Arial" w:hAnsi="Arial"/>
-                <w:b w:val="0"/>
-                <w:sz w:val="16"/>
-              </w:rPr>
-              <w:t>0.9802</w:t>
-            </w:r>
-          </w:p>
-        </w:tc>
-      </w:tr>
-      <w:tr>
-        <w:tc>
-          <w:tcPr>
-            <w:tcW w:type="dxa" w:w="2628"/>
-            <w:vAlign w:val="center"/>
-          </w:tcPr>
-          <w:p>
-            <w:r/>
-            <w:r>
-              <w:rPr>
-                <w:rFonts w:ascii="Arial" w:hAnsi="Arial"/>
-                <w:b w:val="0"/>
-                <w:sz w:val="16"/>
-              </w:rPr>
-              <w:t>Double DQN (dueling)</w:t>
-            </w:r>
-          </w:p>
-        </w:tc>
-        <w:tc>
-          <w:tcPr>
-            <w:tcW w:type="dxa" w:w="2628"/>
-            <w:vAlign w:val="center"/>
-          </w:tcPr>
-          <w:p>
-            <w:r/>
-            <w:r>
-              <w:rPr>
-                <w:rFonts w:ascii="Arial" w:hAnsi="Arial"/>
-                <w:b w:val="0"/>
-                <w:sz w:val="16"/>
-              </w:rPr>
-              <w:t>Shock</w:t>
-            </w:r>
-          </w:p>
-        </w:tc>
-        <w:tc>
-          <w:tcPr>
-            <w:tcW w:type="dxa" w:w="2628"/>
-            <w:vAlign w:val="center"/>
-          </w:tcPr>
-          <w:p>
-            <w:r/>
-            <w:r>
-              <w:rPr>
-                <w:rFonts w:ascii="Arial" w:hAnsi="Arial"/>
-                <w:b w:val="0"/>
-                <w:sz w:val="16"/>
-              </w:rPr>
-              <w:t>116,039.25</w:t>
-            </w:r>
-          </w:p>
-        </w:tc>
-        <w:tc>
-          <w:tcPr>
-            <w:tcW w:type="dxa" w:w="2628"/>
-            <w:vAlign w:val="center"/>
-          </w:tcPr>
-          <w:p>
-            <w:r/>
-            <w:r>
-              <w:rPr>
-                <w:rFonts w:ascii="Arial" w:hAnsi="Arial"/>
-                <w:b w:val="0"/>
-                <w:sz w:val="16"/>
-              </w:rPr>
-              <w:t>0.9778</w:t>
-            </w:r>
-          </w:p>
-        </w:tc>
-      </w:tr>
-      <w:tr>
-        <w:tc>
-          <w:tcPr>
-            <w:tcW w:type="dxa" w:w="2628"/>
-            <w:vAlign w:val="center"/>
-          </w:tcPr>
-          <w:p>
-            <w:r/>
-            <w:r>
-              <w:rPr>
-                <w:rFonts w:ascii="Arial" w:hAnsi="Arial"/>
-                <w:b w:val="0"/>
-                <w:sz w:val="16"/>
-              </w:rPr>
-              <w:t>Double DQN (dueling)</w:t>
-            </w:r>
-          </w:p>
-        </w:tc>
-        <w:tc>
-          <w:tcPr>
-            <w:tcW w:type="dxa" w:w="2628"/>
-            <w:vAlign w:val="center"/>
-          </w:tcPr>
-          <w:p>
-            <w:r/>
-            <w:r>
-              <w:rPr>
-                <w:rFonts w:ascii="Arial" w:hAnsi="Arial"/>
-                <w:b w:val="0"/>
-                <w:sz w:val="16"/>
-              </w:rPr>
-              <w:t>Stationary</w:t>
-            </w:r>
-          </w:p>
-        </w:tc>
-        <w:tc>
-          <w:tcPr>
-            <w:tcW w:type="dxa" w:w="2628"/>
-            <w:vAlign w:val="center"/>
-          </w:tcPr>
-          <w:p>
-            <w:r/>
-            <w:r>
-              <w:rPr>
-                <w:rFonts w:ascii="Arial" w:hAnsi="Arial"/>
-                <w:b w:val="0"/>
-                <w:sz w:val="16"/>
-              </w:rPr>
-              <w:t>107,251.94</w:t>
-            </w:r>
-          </w:p>
-        </w:tc>
-        <w:tc>
-          <w:tcPr>
-            <w:tcW w:type="dxa" w:w="2628"/>
-            <w:vAlign w:val="center"/>
-          </w:tcPr>
-          <w:p>
-            <w:r/>
-            <w:r>
-              <w:rPr>
-                <w:rFonts w:ascii="Arial" w:hAnsi="Arial"/>
-                <w:b w:val="0"/>
-                <w:sz w:val="16"/>
-              </w:rPr>
-              <w:t>0.9829</w:t>
-            </w:r>
-          </w:p>
-        </w:tc>
-      </w:tr>
-      <w:tr>
-        <w:tc>
-          <w:tcPr>
-            <w:tcW w:type="dxa" w:w="2628"/>
-            <w:vAlign w:val="center"/>
-          </w:tcPr>
-          <w:p>
-            <w:r/>
-            <w:r>
-              <w:rPr>
-                <w:rFonts w:ascii="Arial" w:hAnsi="Arial"/>
-                <w:b w:val="0"/>
-                <w:sz w:val="16"/>
-              </w:rPr>
-              <w:t>Double DQN (dueling)</w:t>
-            </w:r>
-          </w:p>
-        </w:tc>
-        <w:tc>
-          <w:tcPr>
-            <w:tcW w:type="dxa" w:w="2628"/>
-            <w:vAlign w:val="center"/>
-          </w:tcPr>
-          <w:p>
-            <w:r/>
-            <w:r>
-              <w:rPr>
-                <w:rFonts w:ascii="Arial" w:hAnsi="Arial"/>
-                <w:b w:val="0"/>
-                <w:sz w:val="16"/>
-              </w:rPr>
-              <w:t>Trend</w:t>
-            </w:r>
-          </w:p>
-        </w:tc>
-        <w:tc>
-          <w:tcPr>
-            <w:tcW w:type="dxa" w:w="2628"/>
-            <w:vAlign w:val="center"/>
-          </w:tcPr>
-          <w:p>
-            <w:r/>
-            <w:r>
-              <w:rPr>
-                <w:rFonts w:ascii="Arial" w:hAnsi="Arial"/>
-                <w:b w:val="0"/>
-                <w:sz w:val="16"/>
-              </w:rPr>
-              <w:t>109,599.31</w:t>
-            </w:r>
-          </w:p>
-        </w:tc>
-        <w:tc>
-          <w:tcPr>
-            <w:tcW w:type="dxa" w:w="2628"/>
-            <w:vAlign w:val="center"/>
-          </w:tcPr>
-          <w:p>
-            <w:r/>
-            <w:r>
-              <w:rPr>
-                <w:rFonts w:ascii="Arial" w:hAnsi="Arial"/>
-                <w:b w:val="0"/>
-                <w:sz w:val="16"/>
-              </w:rPr>
-              <w:t>0.9811</w:t>
+              <w:t>N/A</w:t>
             </w:r>
           </w:p>
         </w:tc>
@@ -1870,45 +1683,241 @@
     </w:tbl>
     <w:p>
       <w:pPr>
-        <w:pStyle w:val="Heading1"/>
+        <w:spacing w:after="60"/>
+        <w:jc w:val="center"/>
       </w:pPr>
       <w:r>
-        <w:t>5. Observations and Inference</w:t>
+        <w:rPr>
+          <w:rFonts w:ascii="Arial" w:hAnsi="Arial"/>
+          <w:b/>
+          <w:sz w:val="18"/>
+        </w:rPr>
+        <w:t>Figure 1. Public leaderboard mean cost by final technique.</w:t>
       </w:r>
     </w:p>
     <w:p>
+      <w:pPr>
+        <w:spacing w:after="60"/>
+        <w:jc w:val="center"/>
+      </w:pPr>
       <w:r>
-        <w:t>PPO and DQN are the strongest public techniques. Representation B materially helped the best PPO run, while Neural Network SARSA became competitive after correcting early-episode demand-statistics handling and using a disciplined promotion run. A2C is more variable but remains a qualifying distinct technique.</w:t>
+        <w:drawing>
+          <wp:inline xmlns:a="http://schemas.openxmlformats.org/drawingml/2006/main" xmlns:pic="http://schemas.openxmlformats.org/drawingml/2006/picture">
+            <wp:extent cx="5669280" cy="2787104"/>
+            <wp:docPr id="1" name="Picture 1"/>
+            <wp:cNvGraphicFramePr>
+              <a:graphicFrameLocks noChangeAspect="1"/>
+            </wp:cNvGraphicFramePr>
+            <a:graphic>
+              <a:graphicData uri="http://schemas.openxmlformats.org/drawingml/2006/picture">
+                <pic:pic>
+                  <pic:nvPicPr>
+                    <pic:cNvPr id="0" name="final_public_scores.png"/>
+                    <pic:cNvPicPr/>
+                  </pic:nvPicPr>
+                  <pic:blipFill>
+                    <a:blip r:embed="rId9"/>
+                    <a:stretch>
+                      <a:fillRect/>
+                    </a:stretch>
+                  </pic:blipFill>
+                  <pic:spPr>
+                    <a:xfrm>
+                      <a:off x="0" y="0"/>
+                      <a:ext cx="5669280" cy="2787104"/>
+                    </a:xfrm>
+                    <a:prstGeom prst="rect"/>
+                  </pic:spPr>
+                </pic:pic>
+              </a:graphicData>
+            </a:graphic>
+          </wp:inline>
+        </w:drawing>
       </w:r>
     </w:p>
     <w:p>
+      <w:pPr>
+        <w:spacing w:after="60"/>
+        <w:jc w:val="left"/>
+      </w:pPr>
       <w:r>
-        <w:t>Double DQN's initial public result was 115,819.00. A dueling joint-action Double DQN candidate reached 111,216.54 on the 200-episode local holdout, improving the Double DQN slot locally without factorizing the scalar reward. Standard Dueling DQN was rejected after poor diagnostic performance, supporting retention of Double-DQN target separation for this problem.</w:t>
+        <w:rPr>
+          <w:rFonts w:ascii="Arial" w:hAnsi="Arial"/>
+          <w:b w:val="0"/>
+          <w:sz w:val="18"/>
+        </w:rPr>
+        <w:t>A2C Representation C official holdout scenario means: random 94,911.88; seasonal 92,426.00; shock 95,611.69; stationary 92,332.50; trend 95,622.25. Overall mean cost 94,180.86 and mean service 0.994717.</w:t>
       </w:r>
     </w:p>
     <w:p>
+      <w:pPr>
+        <w:spacing w:after="60"/>
+        <w:jc w:val="center"/>
+      </w:pPr>
       <w:r>
-        <w:t>The newer Neural Network SARSA seed-20260826 candidate was deliberately not promoted: despite a local mean of 112,872.00, it scored 115,082.25 publicly and therefore underperformed the retained 113,072.38 SARSA submission. The final portfolio therefore uses the older public SARSA artifact.</w:t>
+        <w:rPr>
+          <w:rFonts w:ascii="Arial" w:hAnsi="Arial"/>
+          <w:b/>
+          <w:sz w:val="18"/>
+        </w:rPr>
+        <w:t>Figure 2. A2C Representation C official holdout cost by scenario.</w:t>
       </w:r>
     </w:p>
     <w:p>
+      <w:pPr>
+        <w:spacing w:after="60"/>
+        <w:jc w:val="center"/>
+      </w:pPr>
       <w:r>
-        <w:t>Key lesson: correct observation preprocessing, robust state representation, deterministic inference and careful validation were more reliable drivers of improvement than adding architectural novelty. The main limitation is that public and private scenario configurations are hidden, so the final choice must balance local performance and robustness rather than optimize a single known test set.</w:t>
+        <w:drawing>
+          <wp:inline xmlns:a="http://schemas.openxmlformats.org/drawingml/2006/main" xmlns:pic="http://schemas.openxmlformats.org/drawingml/2006/picture">
+            <wp:extent cx="5669280" cy="2782100"/>
+            <wp:docPr id="2" name="Picture 2"/>
+            <wp:cNvGraphicFramePr>
+              <a:graphicFrameLocks noChangeAspect="1"/>
+            </wp:cNvGraphicFramePr>
+            <a:graphic>
+              <a:graphicData uri="http://schemas.openxmlformats.org/drawingml/2006/picture">
+                <pic:pic>
+                  <pic:nvPicPr>
+                    <pic:cNvPr id="0" name="a2c_scenario_costs.png"/>
+                    <pic:cNvPicPr/>
+                  </pic:nvPicPr>
+                  <pic:blipFill>
+                    <a:blip r:embed="rId10"/>
+                    <a:stretch>
+                      <a:fillRect/>
+                    </a:stretch>
+                  </pic:blipFill>
+                  <pic:spPr>
+                    <a:xfrm>
+                      <a:off x="0" y="0"/>
+                      <a:ext cx="5669280" cy="2782100"/>
+                    </a:xfrm>
+                    <a:prstGeom prst="rect"/>
+                  </pic:spPr>
+                </pic:pic>
+              </a:graphicData>
+            </a:graphic>
+          </wp:inline>
+        </w:drawing>
       </w:r>
     </w:p>
     <w:p>
+      <w:pPr>
+        <w:pStyle w:val="Heading1"/>
+        <w:spacing w:before="100" w:after="60"/>
+      </w:pPr>
       <w:r>
-        <w:t>The professor-provided starter_notebook.ipynb is retained in the final repository unchanged as supplied course material and provides the approved configuration-generation workflow for the assigned V030 variant; the resulting configuration is frozen in training_pipelines/assigned_config.json.</w:t>
+        <w:t>4. Observations and inference</w:t>
+      </w:r>
+    </w:p>
+    <w:p>
+      <w:pPr>
+        <w:spacing w:after="60"/>
+        <w:jc w:val="left"/>
+      </w:pPr>
+      <w:r>
+        <w:rPr>
+          <w:rFonts w:ascii="Arial" w:hAnsi="Arial"/>
+          <w:b w:val="0"/>
+          <w:sz w:val="18"/>
+        </w:rPr>
+        <w:t>PPO and DQN remain the strongest public methods, while the A2C Representation C replacement is the largest portfolio improvement achieved in the final tuning cycle. The A2C result indicates that richer short-history and uncertainty features can materially improve actor-critic inventory decisions when derived only from the documented observation.</w:t>
+      </w:r>
+    </w:p>
+    <w:p>
+      <w:pPr>
+        <w:spacing w:after="60"/>
+        <w:jc w:val="left"/>
+      </w:pPr>
+      <w:r>
+        <w:rPr>
+          <w:rFonts w:ascii="Arial" w:hAnsi="Arial"/>
+          <w:b w:val="0"/>
+          <w:sz w:val="18"/>
+        </w:rPr>
+        <w:t>Neural Network SARSA was retained because its earlier public artifact remains stronger than the final refinement. The last refinement achieved 124,306.75 in screening but 117,164.21 on the official 200-episode holdout and therefore was not promoted. Targeted Double DQN tuning also failed to improve the protected artifact; the best screening run exceeded 1.2 million cost.</w:t>
+      </w:r>
+    </w:p>
+    <w:p>
+      <w:pPr>
+        <w:spacing w:after="60"/>
+        <w:jc w:val="left"/>
+      </w:pPr>
+      <w:r>
+        <w:rPr>
+          <w:rFonts w:ascii="Arial" w:hAnsi="Arial"/>
+          <w:b w:val="0"/>
+          <w:sz w:val="18"/>
+        </w:rPr>
+        <w:t>A key limitation is that public/private evaluation scenarios and hidden parameters are unavailable at inference time. Final selection therefore prioritised robustness across the official holdout rather than optimisation of a single known scenario.</w:t>
+      </w:r>
+    </w:p>
+    <w:p>
+      <w:pPr>
+        <w:pStyle w:val="Heading1"/>
+        <w:spacing w:before="100" w:after="60"/>
+      </w:pPr>
+      <w:r>
+        <w:t>5. Reproducibility and submission mapping</w:t>
+      </w:r>
+    </w:p>
+    <w:p>
+      <w:pPr>
+        <w:spacing w:after="60"/>
+        <w:jc w:val="left"/>
+      </w:pPr>
+      <w:r>
+        <w:rPr>
+          <w:rFonts w:ascii="Arial" w:hAnsi="Arial"/>
+          <w:b w:val="0"/>
+          <w:sz w:val="18"/>
+        </w:rPr>
+        <w:t>The submission contract is run_policy(observation) -&gt; [q1,q2,q3], with each quantity an integer in {0,10,...,100}. Policies perform inference only. They do not train, call env.step() or env.reset(), access future demand or scenario identity, or use the internet.</w:t>
+      </w:r>
+    </w:p>
+    <w:p>
+      <w:pPr>
+        <w:spacing w:after="60"/>
+        <w:jc w:val="left"/>
+      </w:pPr>
+      <w:r>
+        <w:rPr>
+          <w:rFonts w:ascii="Arial" w:hAnsi="Arial"/>
+          <w:b w:val="0"/>
+          <w:sz w:val="18"/>
+        </w:rPr>
+        <w:t>Final artifacts: submissions/ppo/policy.py + model.zip; submissions/dqn/policy.py + model.zip; submissions/neural_sarsa/policy.py + policy_state.pt; submissions/a2c/policy.py + model.zip; submissions/double_dqn/policy.py + model.zip. The final notebook records training recipes, state/action representations, validation evidence, export paths and validator commands.</w:t>
       </w:r>
     </w:p>
     <w:sectPr>
+      <w:footerReference w:type="default" r:id="rId11"/>
       <w:pgSz w:w="12240" w:h="15840"/>
-      <w:pgMar w:top="792" w:right="864" w:bottom="792" w:left="864" w:header="720" w:footer="720" w:gutter="0"/>
+      <w:pgMar w:top="792" w:right="893" w:bottom="792" w:left="893" w:header="720" w:footer="720" w:gutter="0"/>
       <w:cols w:space="720"/>
       <w:docGrid w:linePitch="360"/>
     </w:sectPr>
   </w:body>
 </w:document>
+</file>
+
+<file path=word/footer1.xml><?xml version="1.0" encoding="utf-8"?>
+<w:ftr xmlns:m="http://schemas.openxmlformats.org/officeDocument/2006/math" xmlns:mc="http://schemas.openxmlformats.org/markup-compatibility/2006" xmlns:mo="http://schemas.microsoft.com/office/mac/office/2008/main" xmlns:mv="urn:schemas-microsoft-com:mac:vml" xmlns:o="urn:schemas-microsoft-com:office:office" xmlns:r="http://schemas.openxmlformats.org/officeDocument/2006/relationships" xmlns:v="urn:schemas-microsoft-com:vml" xmlns:w10="urn:schemas-microsoft-com:office:word" xmlns:w14="http://schemas.microsoft.com/office/word/2010/wordml" xmlns:w="http://schemas.openxmlformats.org/wordprocessingml/2006/main" xmlns:wne="http://schemas.microsoft.com/office/word/2006/wordml" xmlns:wp14="http://schemas.microsoft.com/office/word/2010/wordprocessingDrawing" xmlns:wp="http://schemas.openxmlformats.org/drawingml/2006/wordprocessingDrawing" xmlns:wpc="http://schemas.microsoft.com/office/word/2010/wordprocessingCanvas" xmlns:wpg="http://schemas.microsoft.com/office/word/2010/wordprocessingGroup" xmlns:wpi="http://schemas.microsoft.com/office/word/2010/wordprocessingInk" xmlns:wps="http://schemas.microsoft.com/office/word/2010/wordprocessingShape" mc:Ignorable="w14 wp14">
+  <w:p>
+    <w:pPr>
+      <w:pStyle w:val="Footer"/>
+      <w:jc w:val="center"/>
+    </w:pPr>
+    <w:r>
+      <w:rPr>
+        <w:rFonts w:ascii="Arial" w:hAnsi="Arial"/>
+        <w:sz w:val="15"/>
+      </w:rPr>
+      <w:t>IITM RL Course Project 2026 | DA25M579 | V030</w:t>
+    </w:r>
+  </w:p>
+</w:ftr>
 </file>
 
 <file path=word/numbering.xml><?xml version="1.0" encoding="utf-8"?>
@@ -2366,7 +2375,7 @@
       <w:b/>
       <w:bCs/>
       <w:color w:val="4F81BD" w:themeColor="accent1"/>
-      <w:sz w:val="20"/>
+      <w:sz w:val="26"/>
       <w:szCs w:val="26"/>
     </w:rPr>
   </w:style>
@@ -2628,11 +2637,10 @@
     </w:pPr>
     <w:rPr>
       <w:rFonts w:asciiTheme="majorHAnsi" w:eastAsiaTheme="majorEastAsia" w:hAnsiTheme="majorHAnsi" w:cstheme="majorBidi" w:ascii="Arial" w:hAnsi="Arial"/>
-      <w:b/>
       <w:color w:val="17365D" w:themeColor="text2" w:themeShade="BF"/>
       <w:spacing w:val="5"/>
       <w:kern w:val="28"/>
-      <w:sz w:val="36"/>
+      <w:sz w:val="52"/>
       <w:szCs w:val="52"/>
     </w:rPr>
   </w:style>

</xml_diff>